<commit_message>
v1.2.0 : 04_survival added
</commit_message>
<xml_diff>
--- a/output/tables/COAD/table1_APC.docx
+++ b/output/tables/COAD/table1_APC.docx
@@ -18870,2246 +18870,6 @@
       </w:tr>
       <w:tr>
         <w:trPr>
-          <w:trHeight w:val="560" w:hRule="auto"/>
-        </w:trPr>
-        <w:tc>
-          <w:tcPr>
-            <w:tcBorders>
-              <w:bottom w:val="none" w:sz="0" w:space="0" w:color="000000"/>
-              <w:top w:val="none" w:sz="0" w:space="0" w:color="000000"/>
-              <w:left w:val="none" w:sz="0" w:space="0" w:color="000000"/>
-              <w:right w:val="none" w:sz="0" w:space="0" w:color="000000"/>
-            </w:tcBorders>
-            <w:shd w:val="clear" w:color="auto" w:fill="FFFFFF"/>
-            <w:tcMar>
-              <w:top w:w="0" w:type="dxa"/>
-              <w:bottom w:w="0" w:type="dxa"/>
-              <w:left w:w="0" w:type="dxa"/>
-              <w:right w:w="0" w:type="dxa"/>
-            </w:tcMar>
-            <w:vAlign w:val="top"/>
-          </w:tcPr>
-          <w:p>
-            <w:pPr>
-              <w:pStyle w:val="Normal"/>
-              <w:jc w:val="left"/>
-              <w:pBdr>
-                <w:bottom w:val="none" w:sz="0" w:space="0" w:color="000000"/>
-                <w:top w:val="none" w:sz="0" w:space="0" w:color="000000"/>
-                <w:left w:val="none" w:sz="0" w:space="0" w:color="000000"/>
-                <w:right w:val="none" w:sz="0" w:space="0" w:color="000000"/>
-              </w:pBdr>
-              <w:spacing w:after="100" w:before="100" w:line="240"/>
-              <w:ind w:left="300" w:right="100" w:firstLine="0" w:firstLineChars="0"/>
-              <w:rPr>
-                <w:rFonts w:ascii="Times New Roman" w:hAnsi="Times New Roman" w:eastAsia="Times New Roman" w:cs="Times New Roman"/>
-                <w:i w:val="false"/>
-                <w:b w:val="false"/>
-                <w:u w:val="none"/>
-                <w:strike w:val="false"/>
-                <w:sz w:val="18"/>
-                <w:szCs w:val="18"/>
-                <w:color w:val="000000"/>
-              </w:rPr>
-            </w:pPr>
-            <w:r>
-              <w:rPr>
-                <w:rFonts w:ascii="Times New Roman" w:hAnsi="Times New Roman" w:eastAsia="Times New Roman" w:cs="Times New Roman"/>
-                <w:i w:val="false"/>
-                <w:b w:val="false"/>
-                <w:u w:val="none"/>
-                <w:strike w:val="false"/>
-                <w:sz w:val="18"/>
-                <w:szCs w:val="18"/>
-                <w:color w:val="000000"/>
-              </w:rPr>
-              <w:t xml:space="preserve">Missing</w:t>
-            </w:r>
-          </w:p>
-        </w:tc>
-        <w:tc>
-          <w:tcPr>
-            <w:tcBorders>
-              <w:bottom w:val="none" w:sz="0" w:space="0" w:color="000000"/>
-              <w:top w:val="none" w:sz="0" w:space="0" w:color="000000"/>
-              <w:left w:val="none" w:sz="0" w:space="0" w:color="000000"/>
-              <w:right w:val="none" w:sz="0" w:space="0" w:color="000000"/>
-            </w:tcBorders>
-            <w:shd w:val="clear" w:color="auto" w:fill="FFFFFF"/>
-            <w:tcMar>
-              <w:top w:w="0" w:type="dxa"/>
-              <w:bottom w:w="0" w:type="dxa"/>
-              <w:left w:w="0" w:type="dxa"/>
-              <w:right w:w="0" w:type="dxa"/>
-            </w:tcMar>
-            <w:vAlign w:val="top"/>
-          </w:tcPr>
-          <w:p>
-            <w:pPr>
-              <w:pStyle w:val="Normal"/>
-              <w:jc w:val="center"/>
-              <w:pBdr>
-                <w:bottom w:val="none" w:sz="0" w:space="0" w:color="000000"/>
-                <w:top w:val="none" w:sz="0" w:space="0" w:color="000000"/>
-                <w:left w:val="none" w:sz="0" w:space="0" w:color="000000"/>
-                <w:right w:val="none" w:sz="0" w:space="0" w:color="000000"/>
-              </w:pBdr>
-              <w:spacing w:after="100" w:before="100" w:line="240"/>
-              <w:ind w:left="100" w:right="100" w:firstLine="0" w:firstLineChars="0"/>
-              <w:rPr>
-                <w:rFonts w:ascii="Times New Roman" w:hAnsi="Times New Roman" w:eastAsia="Times New Roman" w:cs="Times New Roman"/>
-                <w:i w:val="false"/>
-                <w:b w:val="false"/>
-                <w:u w:val="none"/>
-                <w:strike w:val="false"/>
-                <w:sz w:val="18"/>
-                <w:szCs w:val="18"/>
-                <w:color w:val="000000"/>
-              </w:rPr>
-            </w:pPr>
-            <w:r>
-              <w:rPr>
-                <w:rFonts w:ascii="Times New Roman" w:hAnsi="Times New Roman" w:eastAsia="Times New Roman" w:cs="Times New Roman"/>
-                <w:i w:val="false"/>
-                <w:b w:val="false"/>
-                <w:u w:val="none"/>
-                <w:strike w:val="false"/>
-                <w:sz w:val="18"/>
-                <w:szCs w:val="18"/>
-                <w:color w:val="000000"/>
-              </w:rPr>
-              <w:t xml:space="preserve">45</w:t>
-            </w:r>
-          </w:p>
-        </w:tc>
-        <w:tc>
-          <w:tcPr>
-            <w:tcBorders>
-              <w:bottom w:val="none" w:sz="0" w:space="0" w:color="000000"/>
-              <w:top w:val="none" w:sz="0" w:space="0" w:color="000000"/>
-              <w:left w:val="none" w:sz="0" w:space="0" w:color="000000"/>
-              <w:right w:val="none" w:sz="0" w:space="0" w:color="000000"/>
-            </w:tcBorders>
-            <w:shd w:val="clear" w:color="auto" w:fill="FFFFFF"/>
-            <w:tcMar>
-              <w:top w:w="0" w:type="dxa"/>
-              <w:bottom w:w="0" w:type="dxa"/>
-              <w:left w:w="0" w:type="dxa"/>
-              <w:right w:w="0" w:type="dxa"/>
-            </w:tcMar>
-            <w:vAlign w:val="top"/>
-          </w:tcPr>
-          <w:p>
-            <w:pPr>
-              <w:pStyle w:val="Normal"/>
-              <w:jc w:val="center"/>
-              <w:pBdr>
-                <w:bottom w:val="none" w:sz="0" w:space="0" w:color="000000"/>
-                <w:top w:val="none" w:sz="0" w:space="0" w:color="000000"/>
-                <w:left w:val="none" w:sz="0" w:space="0" w:color="000000"/>
-                <w:right w:val="none" w:sz="0" w:space="0" w:color="000000"/>
-              </w:pBdr>
-              <w:spacing w:after="100" w:before="100" w:line="240"/>
-              <w:ind w:left="100" w:right="100" w:firstLine="0" w:firstLineChars="0"/>
-              <w:rPr>
-                <w:rFonts w:ascii="Times New Roman" w:hAnsi="Times New Roman" w:eastAsia="Times New Roman" w:cs="Times New Roman"/>
-                <w:i w:val="false"/>
-                <w:b w:val="false"/>
-                <w:u w:val="none"/>
-                <w:strike w:val="false"/>
-                <w:sz w:val="18"/>
-                <w:szCs w:val="18"/>
-                <w:color w:val="000000"/>
-              </w:rPr>
-            </w:pPr>
-            <w:r>
-              <w:rPr>
-                <w:rFonts w:ascii="Times New Roman" w:hAnsi="Times New Roman" w:eastAsia="Times New Roman" w:cs="Times New Roman"/>
-                <w:i w:val="false"/>
-                <w:b w:val="false"/>
-                <w:u w:val="none"/>
-                <w:strike w:val="false"/>
-                <w:sz w:val="18"/>
-                <w:szCs w:val="18"/>
-                <w:color w:val="000000"/>
-              </w:rPr>
-              <w:t xml:space="preserve">20</w:t>
-            </w:r>
-          </w:p>
-        </w:tc>
-        <w:tc>
-          <w:tcPr>
-            <w:tcBorders>
-              <w:bottom w:val="none" w:sz="0" w:space="0" w:color="000000"/>
-              <w:top w:val="none" w:sz="0" w:space="0" w:color="000000"/>
-              <w:left w:val="none" w:sz="0" w:space="0" w:color="000000"/>
-              <w:right w:val="none" w:sz="0" w:space="0" w:color="000000"/>
-            </w:tcBorders>
-            <w:shd w:val="clear" w:color="auto" w:fill="FFFFFF"/>
-            <w:tcMar>
-              <w:top w:w="0" w:type="dxa"/>
-              <w:bottom w:w="0" w:type="dxa"/>
-              <w:left w:w="0" w:type="dxa"/>
-              <w:right w:w="0" w:type="dxa"/>
-            </w:tcMar>
-            <w:vAlign w:val="top"/>
-          </w:tcPr>
-          <w:p>
-            <w:pPr>
-              <w:pStyle w:val="Normal"/>
-              <w:jc w:val="center"/>
-              <w:pBdr>
-                <w:bottom w:val="none" w:sz="0" w:space="0" w:color="000000"/>
-                <w:top w:val="none" w:sz="0" w:space="0" w:color="000000"/>
-                <w:left w:val="none" w:sz="0" w:space="0" w:color="000000"/>
-                <w:right w:val="none" w:sz="0" w:space="0" w:color="000000"/>
-              </w:pBdr>
-              <w:spacing w:after="100" w:before="100" w:line="240"/>
-              <w:ind w:left="100" w:right="100" w:firstLine="0" w:firstLineChars="0"/>
-              <w:rPr>
-                <w:rFonts w:ascii="Times New Roman" w:hAnsi="Times New Roman" w:eastAsia="Times New Roman" w:cs="Times New Roman"/>
-                <w:i w:val="false"/>
-                <w:b w:val="false"/>
-                <w:u w:val="none"/>
-                <w:strike w:val="false"/>
-                <w:sz w:val="18"/>
-                <w:szCs w:val="18"/>
-                <w:color w:val="000000"/>
-              </w:rPr>
-            </w:pPr>
-            <w:r>
-              <w:rPr>
-                <w:rFonts w:ascii="Times New Roman" w:hAnsi="Times New Roman" w:eastAsia="Times New Roman" w:cs="Times New Roman"/>
-                <w:i w:val="false"/>
-                <w:b w:val="false"/>
-                <w:u w:val="none"/>
-                <w:strike w:val="false"/>
-                <w:sz w:val="18"/>
-                <w:szCs w:val="18"/>
-                <w:color w:val="000000"/>
-              </w:rPr>
-              <w:t xml:space="preserve">25</w:t>
-            </w:r>
-          </w:p>
-        </w:tc>
-        <w:tc>
-          <w:tcPr>
-            <w:tcBorders>
-              <w:bottom w:val="none" w:sz="0" w:space="0" w:color="000000"/>
-              <w:top w:val="none" w:sz="0" w:space="0" w:color="000000"/>
-              <w:left w:val="none" w:sz="0" w:space="0" w:color="000000"/>
-              <w:right w:val="none" w:sz="0" w:space="0" w:color="000000"/>
-            </w:tcBorders>
-            <w:shd w:val="clear" w:color="auto" w:fill="FFFFFF"/>
-            <w:tcMar>
-              <w:top w:w="0" w:type="dxa"/>
-              <w:bottom w:w="0" w:type="dxa"/>
-              <w:left w:w="0" w:type="dxa"/>
-              <w:right w:w="0" w:type="dxa"/>
-            </w:tcMar>
-            <w:vAlign w:val="top"/>
-          </w:tcPr>
-          <w:p>
-            <w:pPr>
-              <w:pStyle w:val="Normal"/>
-              <w:jc w:val="center"/>
-              <w:pBdr>
-                <w:bottom w:val="none" w:sz="0" w:space="0" w:color="000000"/>
-                <w:top w:val="none" w:sz="0" w:space="0" w:color="000000"/>
-                <w:left w:val="none" w:sz="0" w:space="0" w:color="000000"/>
-                <w:right w:val="none" w:sz="0" w:space="0" w:color="000000"/>
-              </w:pBdr>
-              <w:spacing w:after="100" w:before="100" w:line="240"/>
-              <w:ind w:left="100" w:right="100" w:firstLine="0" w:firstLineChars="0"/>
-              <w:rPr>
-                <w:rFonts w:ascii="Times New Roman" w:hAnsi="Times New Roman" w:eastAsia="Times New Roman" w:cs="Times New Roman"/>
-                <w:i w:val="false"/>
-                <w:b w:val="false"/>
-                <w:u w:val="none"/>
-                <w:strike w:val="false"/>
-                <w:sz w:val="18"/>
-                <w:szCs w:val="18"/>
-                <w:color w:val="000000"/>
-              </w:rPr>
-            </w:pPr>
-            <w:r>
-              <w:rPr>
-                <w:rFonts w:ascii="Times New Roman" w:hAnsi="Times New Roman" w:eastAsia="Times New Roman" w:cs="Times New Roman"/>
-                <w:i w:val="false"/>
-                <w:b w:val="false"/>
-                <w:u w:val="none"/>
-                <w:strike w:val="false"/>
-                <w:sz w:val="18"/>
-                <w:szCs w:val="18"/>
-                <w:color w:val="000000"/>
-              </w:rPr>
-              <w:t xml:space="preserve"/>
-            </w:r>
-          </w:p>
-        </w:tc>
-      </w:tr>
-      <w:tr>
-        <w:trPr>
-          <w:trHeight w:val="560" w:hRule="auto"/>
-        </w:trPr>
-        <w:tc>
-          <w:tcPr>
-            <w:tcBorders>
-              <w:bottom w:val="none" w:sz="0" w:space="0" w:color="000000"/>
-              <w:top w:val="none" w:sz="0" w:space="0" w:color="000000"/>
-              <w:left w:val="none" w:sz="0" w:space="0" w:color="000000"/>
-              <w:right w:val="none" w:sz="0" w:space="0" w:color="000000"/>
-            </w:tcBorders>
-            <w:shd w:val="clear" w:color="auto" w:fill="FFFFFF"/>
-            <w:tcMar>
-              <w:top w:w="0" w:type="dxa"/>
-              <w:bottom w:w="0" w:type="dxa"/>
-              <w:left w:w="0" w:type="dxa"/>
-              <w:right w:w="0" w:type="dxa"/>
-            </w:tcMar>
-            <w:vAlign w:val="top"/>
-          </w:tcPr>
-          <w:p>
-            <w:pPr>
-              <w:pStyle w:val="Normal"/>
-              <w:jc w:val="left"/>
-              <w:pBdr>
-                <w:bottom w:val="none" w:sz="0" w:space="0" w:color="000000"/>
-                <w:top w:val="none" w:sz="0" w:space="0" w:color="000000"/>
-                <w:left w:val="none" w:sz="0" w:space="0" w:color="000000"/>
-                <w:right w:val="none" w:sz="0" w:space="0" w:color="000000"/>
-              </w:pBdr>
-              <w:spacing w:after="100" w:before="100" w:line="240"/>
-              <w:ind w:left="100" w:right="100" w:firstLine="0" w:firstLineChars="0"/>
-              <w:rPr>
-                <w:rFonts w:ascii="Times New Roman" w:hAnsi="Times New Roman" w:eastAsia="Times New Roman" w:cs="Times New Roman"/>
-                <w:i w:val="false"/>
-                <w:b w:val="true"/>
-                <w:u w:val="none"/>
-                <w:strike w:val="false"/>
-                <w:sz w:val="18"/>
-                <w:szCs w:val="18"/>
-                <w:color w:val="000000"/>
-              </w:rPr>
-            </w:pPr>
-            <w:r>
-              <w:rPr>
-                <w:rFonts w:ascii="Times New Roman" w:hAnsi="Times New Roman" w:eastAsia="Times New Roman" w:cs="Times New Roman"/>
-                <w:i w:val="false"/>
-                <w:b w:val="true"/>
-                <w:u w:val="none"/>
-                <w:strike w:val="false"/>
-                <w:sz w:val="18"/>
-                <w:szCs w:val="18"/>
-                <w:color w:val="000000"/>
-              </w:rPr>
-              <w:t xml:space="preserve">KRAS testing performed</w:t>
-            </w:r>
-          </w:p>
-        </w:tc>
-        <w:tc>
-          <w:tcPr>
-            <w:tcBorders>
-              <w:bottom w:val="none" w:sz="0" w:space="0" w:color="000000"/>
-              <w:top w:val="none" w:sz="0" w:space="0" w:color="000000"/>
-              <w:left w:val="none" w:sz="0" w:space="0" w:color="000000"/>
-              <w:right w:val="none" w:sz="0" w:space="0" w:color="000000"/>
-            </w:tcBorders>
-            <w:shd w:val="clear" w:color="auto" w:fill="FFFFFF"/>
-            <w:tcMar>
-              <w:top w:w="0" w:type="dxa"/>
-              <w:bottom w:w="0" w:type="dxa"/>
-              <w:left w:w="0" w:type="dxa"/>
-              <w:right w:w="0" w:type="dxa"/>
-            </w:tcMar>
-            <w:vAlign w:val="top"/>
-          </w:tcPr>
-          <w:p>
-            <w:pPr>
-              <w:pStyle w:val="Normal"/>
-              <w:jc w:val="center"/>
-              <w:pBdr>
-                <w:bottom w:val="none" w:sz="0" w:space="0" w:color="000000"/>
-                <w:top w:val="none" w:sz="0" w:space="0" w:color="000000"/>
-                <w:left w:val="none" w:sz="0" w:space="0" w:color="000000"/>
-                <w:right w:val="none" w:sz="0" w:space="0" w:color="000000"/>
-              </w:pBdr>
-              <w:spacing w:after="100" w:before="100" w:line="240"/>
-              <w:ind w:left="100" w:right="100" w:firstLine="0" w:firstLineChars="0"/>
-              <w:rPr>
-                <w:rFonts w:ascii="Times New Roman" w:hAnsi="Times New Roman" w:eastAsia="Times New Roman" w:cs="Times New Roman"/>
-                <w:i w:val="false"/>
-                <w:b w:val="false"/>
-                <w:u w:val="none"/>
-                <w:strike w:val="false"/>
-                <w:sz w:val="18"/>
-                <w:szCs w:val="18"/>
-                <w:color w:val="000000"/>
-              </w:rPr>
-            </w:pPr>
-            <w:r>
-              <w:rPr>
-                <w:rFonts w:ascii="Times New Roman" w:hAnsi="Times New Roman" w:eastAsia="Times New Roman" w:cs="Times New Roman"/>
-                <w:i w:val="false"/>
-                <w:b w:val="false"/>
-                <w:u w:val="none"/>
-                <w:strike w:val="false"/>
-                <w:sz w:val="18"/>
-                <w:szCs w:val="18"/>
-                <w:color w:val="000000"/>
-              </w:rPr>
-              <w:t xml:space="preserve"/>
-            </w:r>
-          </w:p>
-        </w:tc>
-        <w:tc>
-          <w:tcPr>
-            <w:tcBorders>
-              <w:bottom w:val="none" w:sz="0" w:space="0" w:color="000000"/>
-              <w:top w:val="none" w:sz="0" w:space="0" w:color="000000"/>
-              <w:left w:val="none" w:sz="0" w:space="0" w:color="000000"/>
-              <w:right w:val="none" w:sz="0" w:space="0" w:color="000000"/>
-            </w:tcBorders>
-            <w:shd w:val="clear" w:color="auto" w:fill="FFFFFF"/>
-            <w:tcMar>
-              <w:top w:w="0" w:type="dxa"/>
-              <w:bottom w:w="0" w:type="dxa"/>
-              <w:left w:w="0" w:type="dxa"/>
-              <w:right w:w="0" w:type="dxa"/>
-            </w:tcMar>
-            <w:vAlign w:val="top"/>
-          </w:tcPr>
-          <w:p>
-            <w:pPr>
-              <w:pStyle w:val="Normal"/>
-              <w:jc w:val="center"/>
-              <w:pBdr>
-                <w:bottom w:val="none" w:sz="0" w:space="0" w:color="000000"/>
-                <w:top w:val="none" w:sz="0" w:space="0" w:color="000000"/>
-                <w:left w:val="none" w:sz="0" w:space="0" w:color="000000"/>
-                <w:right w:val="none" w:sz="0" w:space="0" w:color="000000"/>
-              </w:pBdr>
-              <w:spacing w:after="100" w:before="100" w:line="240"/>
-              <w:ind w:left="100" w:right="100" w:firstLine="0" w:firstLineChars="0"/>
-              <w:rPr>
-                <w:rFonts w:ascii="Times New Roman" w:hAnsi="Times New Roman" w:eastAsia="Times New Roman" w:cs="Times New Roman"/>
-                <w:i w:val="false"/>
-                <w:b w:val="false"/>
-                <w:u w:val="none"/>
-                <w:strike w:val="false"/>
-                <w:sz w:val="18"/>
-                <w:szCs w:val="18"/>
-                <w:color w:val="000000"/>
-              </w:rPr>
-            </w:pPr>
-            <w:r>
-              <w:rPr>
-                <w:rFonts w:ascii="Times New Roman" w:hAnsi="Times New Roman" w:eastAsia="Times New Roman" w:cs="Times New Roman"/>
-                <w:i w:val="false"/>
-                <w:b w:val="false"/>
-                <w:u w:val="none"/>
-                <w:strike w:val="false"/>
-                <w:sz w:val="18"/>
-                <w:szCs w:val="18"/>
-                <w:color w:val="000000"/>
-              </w:rPr>
-              <w:t xml:space="preserve"/>
-            </w:r>
-          </w:p>
-        </w:tc>
-        <w:tc>
-          <w:tcPr>
-            <w:tcBorders>
-              <w:bottom w:val="none" w:sz="0" w:space="0" w:color="000000"/>
-              <w:top w:val="none" w:sz="0" w:space="0" w:color="000000"/>
-              <w:left w:val="none" w:sz="0" w:space="0" w:color="000000"/>
-              <w:right w:val="none" w:sz="0" w:space="0" w:color="000000"/>
-            </w:tcBorders>
-            <w:shd w:val="clear" w:color="auto" w:fill="FFFFFF"/>
-            <w:tcMar>
-              <w:top w:w="0" w:type="dxa"/>
-              <w:bottom w:w="0" w:type="dxa"/>
-              <w:left w:w="0" w:type="dxa"/>
-              <w:right w:w="0" w:type="dxa"/>
-            </w:tcMar>
-            <w:vAlign w:val="top"/>
-          </w:tcPr>
-          <w:p>
-            <w:pPr>
-              <w:pStyle w:val="Normal"/>
-              <w:jc w:val="center"/>
-              <w:pBdr>
-                <w:bottom w:val="none" w:sz="0" w:space="0" w:color="000000"/>
-                <w:top w:val="none" w:sz="0" w:space="0" w:color="000000"/>
-                <w:left w:val="none" w:sz="0" w:space="0" w:color="000000"/>
-                <w:right w:val="none" w:sz="0" w:space="0" w:color="000000"/>
-              </w:pBdr>
-              <w:spacing w:after="100" w:before="100" w:line="240"/>
-              <w:ind w:left="100" w:right="100" w:firstLine="0" w:firstLineChars="0"/>
-              <w:rPr>
-                <w:rFonts w:ascii="Times New Roman" w:hAnsi="Times New Roman" w:eastAsia="Times New Roman" w:cs="Times New Roman"/>
-                <w:i w:val="false"/>
-                <w:b w:val="false"/>
-                <w:u w:val="none"/>
-                <w:strike w:val="false"/>
-                <w:sz w:val="18"/>
-                <w:szCs w:val="18"/>
-                <w:color w:val="000000"/>
-              </w:rPr>
-            </w:pPr>
-            <w:r>
-              <w:rPr>
-                <w:rFonts w:ascii="Times New Roman" w:hAnsi="Times New Roman" w:eastAsia="Times New Roman" w:cs="Times New Roman"/>
-                <w:i w:val="false"/>
-                <w:b w:val="false"/>
-                <w:u w:val="none"/>
-                <w:strike w:val="false"/>
-                <w:sz w:val="18"/>
-                <w:szCs w:val="18"/>
-                <w:color w:val="000000"/>
-              </w:rPr>
-              <w:t xml:space="preserve"/>
-            </w:r>
-          </w:p>
-        </w:tc>
-        <w:tc>
-          <w:tcPr>
-            <w:tcBorders>
-              <w:bottom w:val="none" w:sz="0" w:space="0" w:color="000000"/>
-              <w:top w:val="none" w:sz="0" w:space="0" w:color="000000"/>
-              <w:left w:val="none" w:sz="0" w:space="0" w:color="000000"/>
-              <w:right w:val="none" w:sz="0" w:space="0" w:color="000000"/>
-            </w:tcBorders>
-            <w:shd w:val="clear" w:color="auto" w:fill="FFFFFF"/>
-            <w:tcMar>
-              <w:top w:w="0" w:type="dxa"/>
-              <w:bottom w:w="0" w:type="dxa"/>
-              <w:left w:w="0" w:type="dxa"/>
-              <w:right w:w="0" w:type="dxa"/>
-            </w:tcMar>
-            <w:vAlign w:val="top"/>
-          </w:tcPr>
-          <w:p>
-            <w:pPr>
-              <w:pStyle w:val="Normal"/>
-              <w:jc w:val="center"/>
-              <w:pBdr>
-                <w:bottom w:val="none" w:sz="0" w:space="0" w:color="000000"/>
-                <w:top w:val="none" w:sz="0" w:space="0" w:color="000000"/>
-                <w:left w:val="none" w:sz="0" w:space="0" w:color="000000"/>
-                <w:right w:val="none" w:sz="0" w:space="0" w:color="000000"/>
-              </w:pBdr>
-              <w:spacing w:after="100" w:before="100" w:line="240"/>
-              <w:ind w:left="100" w:right="100" w:firstLine="0" w:firstLineChars="0"/>
-              <w:rPr>
-                <w:rFonts w:ascii="Times New Roman" w:hAnsi="Times New Roman" w:eastAsia="Times New Roman" w:cs="Times New Roman"/>
-                <w:i w:val="false"/>
-                <w:b w:val="false"/>
-                <w:u w:val="none"/>
-                <w:strike w:val="false"/>
-                <w:sz w:val="18"/>
-                <w:szCs w:val="18"/>
-                <w:color w:val="000000"/>
-              </w:rPr>
-            </w:pPr>
-            <w:r>
-              <w:rPr>
-                <w:rFonts w:ascii="Times New Roman" w:hAnsi="Times New Roman" w:eastAsia="Times New Roman" w:cs="Times New Roman"/>
-                <w:i w:val="false"/>
-                <w:b w:val="false"/>
-                <w:u w:val="none"/>
-                <w:strike w:val="false"/>
-                <w:sz w:val="18"/>
-                <w:szCs w:val="18"/>
-                <w:color w:val="000000"/>
-              </w:rPr>
-              <w:t xml:space="preserve">0.124</w:t>
-            </w:r>
-          </w:p>
-        </w:tc>
-      </w:tr>
-      <w:tr>
-        <w:trPr>
-          <w:trHeight w:val="560" w:hRule="auto"/>
-        </w:trPr>
-        <w:tc>
-          <w:tcPr>
-            <w:tcBorders>
-              <w:bottom w:val="none" w:sz="0" w:space="0" w:color="000000"/>
-              <w:top w:val="none" w:sz="0" w:space="0" w:color="000000"/>
-              <w:left w:val="none" w:sz="0" w:space="0" w:color="000000"/>
-              <w:right w:val="none" w:sz="0" w:space="0" w:color="000000"/>
-            </w:tcBorders>
-            <w:shd w:val="clear" w:color="auto" w:fill="FFFFFF"/>
-            <w:tcMar>
-              <w:top w:w="0" w:type="dxa"/>
-              <w:bottom w:w="0" w:type="dxa"/>
-              <w:left w:w="0" w:type="dxa"/>
-              <w:right w:w="0" w:type="dxa"/>
-            </w:tcMar>
-            <w:vAlign w:val="top"/>
-          </w:tcPr>
-          <w:p>
-            <w:pPr>
-              <w:pStyle w:val="Normal"/>
-              <w:jc w:val="left"/>
-              <w:pBdr>
-                <w:bottom w:val="none" w:sz="0" w:space="0" w:color="000000"/>
-                <w:top w:val="none" w:sz="0" w:space="0" w:color="000000"/>
-                <w:left w:val="none" w:sz="0" w:space="0" w:color="000000"/>
-                <w:right w:val="none" w:sz="0" w:space="0" w:color="000000"/>
-              </w:pBdr>
-              <w:spacing w:after="100" w:before="100" w:line="240"/>
-              <w:ind w:left="300" w:right="100" w:firstLine="0" w:firstLineChars="0"/>
-              <w:rPr>
-                <w:rFonts w:ascii="Times New Roman" w:hAnsi="Times New Roman" w:eastAsia="Times New Roman" w:cs="Times New Roman"/>
-                <w:i w:val="false"/>
-                <w:b w:val="false"/>
-                <w:u w:val="none"/>
-                <w:strike w:val="false"/>
-                <w:sz w:val="18"/>
-                <w:szCs w:val="18"/>
-                <w:color w:val="000000"/>
-              </w:rPr>
-            </w:pPr>
-            <w:r>
-              <w:rPr>
-                <w:rFonts w:ascii="Times New Roman" w:hAnsi="Times New Roman" w:eastAsia="Times New Roman" w:cs="Times New Roman"/>
-                <w:i w:val="false"/>
-                <w:b w:val="false"/>
-                <w:u w:val="none"/>
-                <w:strike w:val="false"/>
-                <w:sz w:val="18"/>
-                <w:szCs w:val="18"/>
-                <w:color w:val="000000"/>
-              </w:rPr>
-              <w:t xml:space="preserve">No</w:t>
-            </w:r>
-          </w:p>
-        </w:tc>
-        <w:tc>
-          <w:tcPr>
-            <w:tcBorders>
-              <w:bottom w:val="none" w:sz="0" w:space="0" w:color="000000"/>
-              <w:top w:val="none" w:sz="0" w:space="0" w:color="000000"/>
-              <w:left w:val="none" w:sz="0" w:space="0" w:color="000000"/>
-              <w:right w:val="none" w:sz="0" w:space="0" w:color="000000"/>
-            </w:tcBorders>
-            <w:shd w:val="clear" w:color="auto" w:fill="FFFFFF"/>
-            <w:tcMar>
-              <w:top w:w="0" w:type="dxa"/>
-              <w:bottom w:w="0" w:type="dxa"/>
-              <w:left w:w="0" w:type="dxa"/>
-              <w:right w:w="0" w:type="dxa"/>
-            </w:tcMar>
-            <w:vAlign w:val="top"/>
-          </w:tcPr>
-          <w:p>
-            <w:pPr>
-              <w:pStyle w:val="Normal"/>
-              <w:jc w:val="center"/>
-              <w:pBdr>
-                <w:bottom w:val="none" w:sz="0" w:space="0" w:color="000000"/>
-                <w:top w:val="none" w:sz="0" w:space="0" w:color="000000"/>
-                <w:left w:val="none" w:sz="0" w:space="0" w:color="000000"/>
-                <w:right w:val="none" w:sz="0" w:space="0" w:color="000000"/>
-              </w:pBdr>
-              <w:spacing w:after="100" w:before="100" w:line="240"/>
-              <w:ind w:left="100" w:right="100" w:firstLine="0" w:firstLineChars="0"/>
-              <w:rPr>
-                <w:rFonts w:ascii="Times New Roman" w:hAnsi="Times New Roman" w:eastAsia="Times New Roman" w:cs="Times New Roman"/>
-                <w:i w:val="false"/>
-                <w:b w:val="false"/>
-                <w:u w:val="none"/>
-                <w:strike w:val="false"/>
-                <w:sz w:val="18"/>
-                <w:szCs w:val="18"/>
-                <w:color w:val="000000"/>
-              </w:rPr>
-            </w:pPr>
-            <w:r>
-              <w:rPr>
-                <w:rFonts w:ascii="Times New Roman" w:hAnsi="Times New Roman" w:eastAsia="Times New Roman" w:cs="Times New Roman"/>
-                <w:i w:val="false"/>
-                <w:b w:val="false"/>
-                <w:u w:val="none"/>
-                <w:strike w:val="false"/>
-                <w:sz w:val="18"/>
-                <w:szCs w:val="18"/>
-                <w:color w:val="000000"/>
-              </w:rPr>
-              <w:t xml:space="preserve">352 (88.0%)</w:t>
-            </w:r>
-          </w:p>
-        </w:tc>
-        <w:tc>
-          <w:tcPr>
-            <w:tcBorders>
-              <w:bottom w:val="none" w:sz="0" w:space="0" w:color="000000"/>
-              <w:top w:val="none" w:sz="0" w:space="0" w:color="000000"/>
-              <w:left w:val="none" w:sz="0" w:space="0" w:color="000000"/>
-              <w:right w:val="none" w:sz="0" w:space="0" w:color="000000"/>
-            </w:tcBorders>
-            <w:shd w:val="clear" w:color="auto" w:fill="FFFFFF"/>
-            <w:tcMar>
-              <w:top w:w="0" w:type="dxa"/>
-              <w:bottom w:w="0" w:type="dxa"/>
-              <w:left w:w="0" w:type="dxa"/>
-              <w:right w:w="0" w:type="dxa"/>
-            </w:tcMar>
-            <w:vAlign w:val="top"/>
-          </w:tcPr>
-          <w:p>
-            <w:pPr>
-              <w:pStyle w:val="Normal"/>
-              <w:jc w:val="center"/>
-              <w:pBdr>
-                <w:bottom w:val="none" w:sz="0" w:space="0" w:color="000000"/>
-                <w:top w:val="none" w:sz="0" w:space="0" w:color="000000"/>
-                <w:left w:val="none" w:sz="0" w:space="0" w:color="000000"/>
-                <w:right w:val="none" w:sz="0" w:space="0" w:color="000000"/>
-              </w:pBdr>
-              <w:spacing w:after="100" w:before="100" w:line="240"/>
-              <w:ind w:left="100" w:right="100" w:firstLine="0" w:firstLineChars="0"/>
-              <w:rPr>
-                <w:rFonts w:ascii="Times New Roman" w:hAnsi="Times New Roman" w:eastAsia="Times New Roman" w:cs="Times New Roman"/>
-                <w:i w:val="false"/>
-                <w:b w:val="false"/>
-                <w:u w:val="none"/>
-                <w:strike w:val="false"/>
-                <w:sz w:val="18"/>
-                <w:szCs w:val="18"/>
-                <w:color w:val="000000"/>
-              </w:rPr>
-            </w:pPr>
-            <w:r>
-              <w:rPr>
-                <w:rFonts w:ascii="Times New Roman" w:hAnsi="Times New Roman" w:eastAsia="Times New Roman" w:cs="Times New Roman"/>
-                <w:i w:val="false"/>
-                <w:b w:val="false"/>
-                <w:u w:val="none"/>
-                <w:strike w:val="false"/>
-                <w:sz w:val="18"/>
-                <w:szCs w:val="18"/>
-                <w:color w:val="000000"/>
-              </w:rPr>
-              <w:t xml:space="preserve">181 (90.5%)</w:t>
-            </w:r>
-          </w:p>
-        </w:tc>
-        <w:tc>
-          <w:tcPr>
-            <w:tcBorders>
-              <w:bottom w:val="none" w:sz="0" w:space="0" w:color="000000"/>
-              <w:top w:val="none" w:sz="0" w:space="0" w:color="000000"/>
-              <w:left w:val="none" w:sz="0" w:space="0" w:color="000000"/>
-              <w:right w:val="none" w:sz="0" w:space="0" w:color="000000"/>
-            </w:tcBorders>
-            <w:shd w:val="clear" w:color="auto" w:fill="FFFFFF"/>
-            <w:tcMar>
-              <w:top w:w="0" w:type="dxa"/>
-              <w:bottom w:w="0" w:type="dxa"/>
-              <w:left w:w="0" w:type="dxa"/>
-              <w:right w:w="0" w:type="dxa"/>
-            </w:tcMar>
-            <w:vAlign w:val="top"/>
-          </w:tcPr>
-          <w:p>
-            <w:pPr>
-              <w:pStyle w:val="Normal"/>
-              <w:jc w:val="center"/>
-              <w:pBdr>
-                <w:bottom w:val="none" w:sz="0" w:space="0" w:color="000000"/>
-                <w:top w:val="none" w:sz="0" w:space="0" w:color="000000"/>
-                <w:left w:val="none" w:sz="0" w:space="0" w:color="000000"/>
-                <w:right w:val="none" w:sz="0" w:space="0" w:color="000000"/>
-              </w:pBdr>
-              <w:spacing w:after="100" w:before="100" w:line="240"/>
-              <w:ind w:left="100" w:right="100" w:firstLine="0" w:firstLineChars="0"/>
-              <w:rPr>
-                <w:rFonts w:ascii="Times New Roman" w:hAnsi="Times New Roman" w:eastAsia="Times New Roman" w:cs="Times New Roman"/>
-                <w:i w:val="false"/>
-                <w:b w:val="false"/>
-                <w:u w:val="none"/>
-                <w:strike w:val="false"/>
-                <w:sz w:val="18"/>
-                <w:szCs w:val="18"/>
-                <w:color w:val="000000"/>
-              </w:rPr>
-            </w:pPr>
-            <w:r>
-              <w:rPr>
-                <w:rFonts w:ascii="Times New Roman" w:hAnsi="Times New Roman" w:eastAsia="Times New Roman" w:cs="Times New Roman"/>
-                <w:i w:val="false"/>
-                <w:b w:val="false"/>
-                <w:u w:val="none"/>
-                <w:strike w:val="false"/>
-                <w:sz w:val="18"/>
-                <w:szCs w:val="18"/>
-                <w:color w:val="000000"/>
-              </w:rPr>
-              <w:t xml:space="preserve">171 (85.5%)</w:t>
-            </w:r>
-          </w:p>
-        </w:tc>
-        <w:tc>
-          <w:tcPr>
-            <w:tcBorders>
-              <w:bottom w:val="none" w:sz="0" w:space="0" w:color="000000"/>
-              <w:top w:val="none" w:sz="0" w:space="0" w:color="000000"/>
-              <w:left w:val="none" w:sz="0" w:space="0" w:color="000000"/>
-              <w:right w:val="none" w:sz="0" w:space="0" w:color="000000"/>
-            </w:tcBorders>
-            <w:shd w:val="clear" w:color="auto" w:fill="FFFFFF"/>
-            <w:tcMar>
-              <w:top w:w="0" w:type="dxa"/>
-              <w:bottom w:w="0" w:type="dxa"/>
-              <w:left w:w="0" w:type="dxa"/>
-              <w:right w:w="0" w:type="dxa"/>
-            </w:tcMar>
-            <w:vAlign w:val="top"/>
-          </w:tcPr>
-          <w:p>
-            <w:pPr>
-              <w:pStyle w:val="Normal"/>
-              <w:jc w:val="center"/>
-              <w:pBdr>
-                <w:bottom w:val="none" w:sz="0" w:space="0" w:color="000000"/>
-                <w:top w:val="none" w:sz="0" w:space="0" w:color="000000"/>
-                <w:left w:val="none" w:sz="0" w:space="0" w:color="000000"/>
-                <w:right w:val="none" w:sz="0" w:space="0" w:color="000000"/>
-              </w:pBdr>
-              <w:spacing w:after="100" w:before="100" w:line="240"/>
-              <w:ind w:left="100" w:right="100" w:firstLine="0" w:firstLineChars="0"/>
-              <w:rPr>
-                <w:rFonts w:ascii="Times New Roman" w:hAnsi="Times New Roman" w:eastAsia="Times New Roman" w:cs="Times New Roman"/>
-                <w:i w:val="false"/>
-                <w:b w:val="false"/>
-                <w:u w:val="none"/>
-                <w:strike w:val="false"/>
-                <w:sz w:val="18"/>
-                <w:szCs w:val="18"/>
-                <w:color w:val="000000"/>
-              </w:rPr>
-            </w:pPr>
-            <w:r>
-              <w:rPr>
-                <w:rFonts w:ascii="Times New Roman" w:hAnsi="Times New Roman" w:eastAsia="Times New Roman" w:cs="Times New Roman"/>
-                <w:i w:val="false"/>
-                <w:b w:val="false"/>
-                <w:u w:val="none"/>
-                <w:strike w:val="false"/>
-                <w:sz w:val="18"/>
-                <w:szCs w:val="18"/>
-                <w:color w:val="000000"/>
-              </w:rPr>
-              <w:t xml:space="preserve"/>
-            </w:r>
-          </w:p>
-        </w:tc>
-      </w:tr>
-      <w:tr>
-        <w:trPr>
-          <w:trHeight w:val="560" w:hRule="auto"/>
-        </w:trPr>
-        <w:tc>
-          <w:tcPr>
-            <w:tcBorders>
-              <w:bottom w:val="none" w:sz="0" w:space="0" w:color="000000"/>
-              <w:top w:val="none" w:sz="0" w:space="0" w:color="000000"/>
-              <w:left w:val="none" w:sz="0" w:space="0" w:color="000000"/>
-              <w:right w:val="none" w:sz="0" w:space="0" w:color="000000"/>
-            </w:tcBorders>
-            <w:shd w:val="clear" w:color="auto" w:fill="FFFFFF"/>
-            <w:tcMar>
-              <w:top w:w="0" w:type="dxa"/>
-              <w:bottom w:w="0" w:type="dxa"/>
-              <w:left w:w="0" w:type="dxa"/>
-              <w:right w:w="0" w:type="dxa"/>
-            </w:tcMar>
-            <w:vAlign w:val="top"/>
-          </w:tcPr>
-          <w:p>
-            <w:pPr>
-              <w:pStyle w:val="Normal"/>
-              <w:jc w:val="left"/>
-              <w:pBdr>
-                <w:bottom w:val="none" w:sz="0" w:space="0" w:color="000000"/>
-                <w:top w:val="none" w:sz="0" w:space="0" w:color="000000"/>
-                <w:left w:val="none" w:sz="0" w:space="0" w:color="000000"/>
-                <w:right w:val="none" w:sz="0" w:space="0" w:color="000000"/>
-              </w:pBdr>
-              <w:spacing w:after="100" w:before="100" w:line="240"/>
-              <w:ind w:left="300" w:right="100" w:firstLine="0" w:firstLineChars="0"/>
-              <w:rPr>
-                <w:rFonts w:ascii="Times New Roman" w:hAnsi="Times New Roman" w:eastAsia="Times New Roman" w:cs="Times New Roman"/>
-                <w:i w:val="false"/>
-                <w:b w:val="false"/>
-                <w:u w:val="none"/>
-                <w:strike w:val="false"/>
-                <w:sz w:val="18"/>
-                <w:szCs w:val="18"/>
-                <w:color w:val="000000"/>
-              </w:rPr>
-            </w:pPr>
-            <w:r>
-              <w:rPr>
-                <w:rFonts w:ascii="Times New Roman" w:hAnsi="Times New Roman" w:eastAsia="Times New Roman" w:cs="Times New Roman"/>
-                <w:i w:val="false"/>
-                <w:b w:val="false"/>
-                <w:u w:val="none"/>
-                <w:strike w:val="false"/>
-                <w:sz w:val="18"/>
-                <w:szCs w:val="18"/>
-                <w:color w:val="000000"/>
-              </w:rPr>
-              <w:t xml:space="preserve">Yes</w:t>
-            </w:r>
-          </w:p>
-        </w:tc>
-        <w:tc>
-          <w:tcPr>
-            <w:tcBorders>
-              <w:bottom w:val="none" w:sz="0" w:space="0" w:color="000000"/>
-              <w:top w:val="none" w:sz="0" w:space="0" w:color="000000"/>
-              <w:left w:val="none" w:sz="0" w:space="0" w:color="000000"/>
-              <w:right w:val="none" w:sz="0" w:space="0" w:color="000000"/>
-            </w:tcBorders>
-            <w:shd w:val="clear" w:color="auto" w:fill="FFFFFF"/>
-            <w:tcMar>
-              <w:top w:w="0" w:type="dxa"/>
-              <w:bottom w:w="0" w:type="dxa"/>
-              <w:left w:w="0" w:type="dxa"/>
-              <w:right w:w="0" w:type="dxa"/>
-            </w:tcMar>
-            <w:vAlign w:val="top"/>
-          </w:tcPr>
-          <w:p>
-            <w:pPr>
-              <w:pStyle w:val="Normal"/>
-              <w:jc w:val="center"/>
-              <w:pBdr>
-                <w:bottom w:val="none" w:sz="0" w:space="0" w:color="000000"/>
-                <w:top w:val="none" w:sz="0" w:space="0" w:color="000000"/>
-                <w:left w:val="none" w:sz="0" w:space="0" w:color="000000"/>
-                <w:right w:val="none" w:sz="0" w:space="0" w:color="000000"/>
-              </w:pBdr>
-              <w:spacing w:after="100" w:before="100" w:line="240"/>
-              <w:ind w:left="100" w:right="100" w:firstLine="0" w:firstLineChars="0"/>
-              <w:rPr>
-                <w:rFonts w:ascii="Times New Roman" w:hAnsi="Times New Roman" w:eastAsia="Times New Roman" w:cs="Times New Roman"/>
-                <w:i w:val="false"/>
-                <w:b w:val="false"/>
-                <w:u w:val="none"/>
-                <w:strike w:val="false"/>
-                <w:sz w:val="18"/>
-                <w:szCs w:val="18"/>
-                <w:color w:val="000000"/>
-              </w:rPr>
-            </w:pPr>
-            <w:r>
-              <w:rPr>
-                <w:rFonts w:ascii="Times New Roman" w:hAnsi="Times New Roman" w:eastAsia="Times New Roman" w:cs="Times New Roman"/>
-                <w:i w:val="false"/>
-                <w:b w:val="false"/>
-                <w:u w:val="none"/>
-                <w:strike w:val="false"/>
-                <w:sz w:val="18"/>
-                <w:szCs w:val="18"/>
-                <w:color w:val="000000"/>
-              </w:rPr>
-              <w:t xml:space="preserve">48 (12.0%)</w:t>
-            </w:r>
-          </w:p>
-        </w:tc>
-        <w:tc>
-          <w:tcPr>
-            <w:tcBorders>
-              <w:bottom w:val="none" w:sz="0" w:space="0" w:color="000000"/>
-              <w:top w:val="none" w:sz="0" w:space="0" w:color="000000"/>
-              <w:left w:val="none" w:sz="0" w:space="0" w:color="000000"/>
-              <w:right w:val="none" w:sz="0" w:space="0" w:color="000000"/>
-            </w:tcBorders>
-            <w:shd w:val="clear" w:color="auto" w:fill="FFFFFF"/>
-            <w:tcMar>
-              <w:top w:w="0" w:type="dxa"/>
-              <w:bottom w:w="0" w:type="dxa"/>
-              <w:left w:w="0" w:type="dxa"/>
-              <w:right w:w="0" w:type="dxa"/>
-            </w:tcMar>
-            <w:vAlign w:val="top"/>
-          </w:tcPr>
-          <w:p>
-            <w:pPr>
-              <w:pStyle w:val="Normal"/>
-              <w:jc w:val="center"/>
-              <w:pBdr>
-                <w:bottom w:val="none" w:sz="0" w:space="0" w:color="000000"/>
-                <w:top w:val="none" w:sz="0" w:space="0" w:color="000000"/>
-                <w:left w:val="none" w:sz="0" w:space="0" w:color="000000"/>
-                <w:right w:val="none" w:sz="0" w:space="0" w:color="000000"/>
-              </w:pBdr>
-              <w:spacing w:after="100" w:before="100" w:line="240"/>
-              <w:ind w:left="100" w:right="100" w:firstLine="0" w:firstLineChars="0"/>
-              <w:rPr>
-                <w:rFonts w:ascii="Times New Roman" w:hAnsi="Times New Roman" w:eastAsia="Times New Roman" w:cs="Times New Roman"/>
-                <w:i w:val="false"/>
-                <w:b w:val="false"/>
-                <w:u w:val="none"/>
-                <w:strike w:val="false"/>
-                <w:sz w:val="18"/>
-                <w:szCs w:val="18"/>
-                <w:color w:val="000000"/>
-              </w:rPr>
-            </w:pPr>
-            <w:r>
-              <w:rPr>
-                <w:rFonts w:ascii="Times New Roman" w:hAnsi="Times New Roman" w:eastAsia="Times New Roman" w:cs="Times New Roman"/>
-                <w:i w:val="false"/>
-                <w:b w:val="false"/>
-                <w:u w:val="none"/>
-                <w:strike w:val="false"/>
-                <w:sz w:val="18"/>
-                <w:szCs w:val="18"/>
-                <w:color w:val="000000"/>
-              </w:rPr>
-              <w:t xml:space="preserve">19 (9.5%)</w:t>
-            </w:r>
-          </w:p>
-        </w:tc>
-        <w:tc>
-          <w:tcPr>
-            <w:tcBorders>
-              <w:bottom w:val="none" w:sz="0" w:space="0" w:color="000000"/>
-              <w:top w:val="none" w:sz="0" w:space="0" w:color="000000"/>
-              <w:left w:val="none" w:sz="0" w:space="0" w:color="000000"/>
-              <w:right w:val="none" w:sz="0" w:space="0" w:color="000000"/>
-            </w:tcBorders>
-            <w:shd w:val="clear" w:color="auto" w:fill="FFFFFF"/>
-            <w:tcMar>
-              <w:top w:w="0" w:type="dxa"/>
-              <w:bottom w:w="0" w:type="dxa"/>
-              <w:left w:w="0" w:type="dxa"/>
-              <w:right w:w="0" w:type="dxa"/>
-            </w:tcMar>
-            <w:vAlign w:val="top"/>
-          </w:tcPr>
-          <w:p>
-            <w:pPr>
-              <w:pStyle w:val="Normal"/>
-              <w:jc w:val="center"/>
-              <w:pBdr>
-                <w:bottom w:val="none" w:sz="0" w:space="0" w:color="000000"/>
-                <w:top w:val="none" w:sz="0" w:space="0" w:color="000000"/>
-                <w:left w:val="none" w:sz="0" w:space="0" w:color="000000"/>
-                <w:right w:val="none" w:sz="0" w:space="0" w:color="000000"/>
-              </w:pBdr>
-              <w:spacing w:after="100" w:before="100" w:line="240"/>
-              <w:ind w:left="100" w:right="100" w:firstLine="0" w:firstLineChars="0"/>
-              <w:rPr>
-                <w:rFonts w:ascii="Times New Roman" w:hAnsi="Times New Roman" w:eastAsia="Times New Roman" w:cs="Times New Roman"/>
-                <w:i w:val="false"/>
-                <w:b w:val="false"/>
-                <w:u w:val="none"/>
-                <w:strike w:val="false"/>
-                <w:sz w:val="18"/>
-                <w:szCs w:val="18"/>
-                <w:color w:val="000000"/>
-              </w:rPr>
-            </w:pPr>
-            <w:r>
-              <w:rPr>
-                <w:rFonts w:ascii="Times New Roman" w:hAnsi="Times New Roman" w:eastAsia="Times New Roman" w:cs="Times New Roman"/>
-                <w:i w:val="false"/>
-                <w:b w:val="false"/>
-                <w:u w:val="none"/>
-                <w:strike w:val="false"/>
-                <w:sz w:val="18"/>
-                <w:szCs w:val="18"/>
-                <w:color w:val="000000"/>
-              </w:rPr>
-              <w:t xml:space="preserve">29 (14.5%)</w:t>
-            </w:r>
-          </w:p>
-        </w:tc>
-        <w:tc>
-          <w:tcPr>
-            <w:tcBorders>
-              <w:bottom w:val="none" w:sz="0" w:space="0" w:color="000000"/>
-              <w:top w:val="none" w:sz="0" w:space="0" w:color="000000"/>
-              <w:left w:val="none" w:sz="0" w:space="0" w:color="000000"/>
-              <w:right w:val="none" w:sz="0" w:space="0" w:color="000000"/>
-            </w:tcBorders>
-            <w:shd w:val="clear" w:color="auto" w:fill="FFFFFF"/>
-            <w:tcMar>
-              <w:top w:w="0" w:type="dxa"/>
-              <w:bottom w:w="0" w:type="dxa"/>
-              <w:left w:w="0" w:type="dxa"/>
-              <w:right w:w="0" w:type="dxa"/>
-            </w:tcMar>
-            <w:vAlign w:val="top"/>
-          </w:tcPr>
-          <w:p>
-            <w:pPr>
-              <w:pStyle w:val="Normal"/>
-              <w:jc w:val="center"/>
-              <w:pBdr>
-                <w:bottom w:val="none" w:sz="0" w:space="0" w:color="000000"/>
-                <w:top w:val="none" w:sz="0" w:space="0" w:color="000000"/>
-                <w:left w:val="none" w:sz="0" w:space="0" w:color="000000"/>
-                <w:right w:val="none" w:sz="0" w:space="0" w:color="000000"/>
-              </w:pBdr>
-              <w:spacing w:after="100" w:before="100" w:line="240"/>
-              <w:ind w:left="100" w:right="100" w:firstLine="0" w:firstLineChars="0"/>
-              <w:rPr>
-                <w:rFonts w:ascii="Times New Roman" w:hAnsi="Times New Roman" w:eastAsia="Times New Roman" w:cs="Times New Roman"/>
-                <w:i w:val="false"/>
-                <w:b w:val="false"/>
-                <w:u w:val="none"/>
-                <w:strike w:val="false"/>
-                <w:sz w:val="18"/>
-                <w:szCs w:val="18"/>
-                <w:color w:val="000000"/>
-              </w:rPr>
-            </w:pPr>
-            <w:r>
-              <w:rPr>
-                <w:rFonts w:ascii="Times New Roman" w:hAnsi="Times New Roman" w:eastAsia="Times New Roman" w:cs="Times New Roman"/>
-                <w:i w:val="false"/>
-                <w:b w:val="false"/>
-                <w:u w:val="none"/>
-                <w:strike w:val="false"/>
-                <w:sz w:val="18"/>
-                <w:szCs w:val="18"/>
-                <w:color w:val="000000"/>
-              </w:rPr>
-              <w:t xml:space="preserve"/>
-            </w:r>
-          </w:p>
-        </w:tc>
-      </w:tr>
-      <w:tr>
-        <w:trPr>
-          <w:trHeight w:val="560" w:hRule="auto"/>
-        </w:trPr>
-        <w:tc>
-          <w:tcPr>
-            <w:tcBorders>
-              <w:bottom w:val="none" w:sz="0" w:space="0" w:color="000000"/>
-              <w:top w:val="none" w:sz="0" w:space="0" w:color="000000"/>
-              <w:left w:val="none" w:sz="0" w:space="0" w:color="000000"/>
-              <w:right w:val="none" w:sz="0" w:space="0" w:color="000000"/>
-            </w:tcBorders>
-            <w:shd w:val="clear" w:color="auto" w:fill="FFFFFF"/>
-            <w:tcMar>
-              <w:top w:w="0" w:type="dxa"/>
-              <w:bottom w:w="0" w:type="dxa"/>
-              <w:left w:w="0" w:type="dxa"/>
-              <w:right w:w="0" w:type="dxa"/>
-            </w:tcMar>
-            <w:vAlign w:val="top"/>
-          </w:tcPr>
-          <w:p>
-            <w:pPr>
-              <w:pStyle w:val="Normal"/>
-              <w:jc w:val="left"/>
-              <w:pBdr>
-                <w:bottom w:val="none" w:sz="0" w:space="0" w:color="000000"/>
-                <w:top w:val="none" w:sz="0" w:space="0" w:color="000000"/>
-                <w:left w:val="none" w:sz="0" w:space="0" w:color="000000"/>
-                <w:right w:val="none" w:sz="0" w:space="0" w:color="000000"/>
-              </w:pBdr>
-              <w:spacing w:after="100" w:before="100" w:line="240"/>
-              <w:ind w:left="300" w:right="100" w:firstLine="0" w:firstLineChars="0"/>
-              <w:rPr>
-                <w:rFonts w:ascii="Times New Roman" w:hAnsi="Times New Roman" w:eastAsia="Times New Roman" w:cs="Times New Roman"/>
-                <w:i w:val="false"/>
-                <w:b w:val="false"/>
-                <w:u w:val="none"/>
-                <w:strike w:val="false"/>
-                <w:sz w:val="18"/>
-                <w:szCs w:val="18"/>
-                <w:color w:val="000000"/>
-              </w:rPr>
-            </w:pPr>
-            <w:r>
-              <w:rPr>
-                <w:rFonts w:ascii="Times New Roman" w:hAnsi="Times New Roman" w:eastAsia="Times New Roman" w:cs="Times New Roman"/>
-                <w:i w:val="false"/>
-                <w:b w:val="false"/>
-                <w:u w:val="none"/>
-                <w:strike w:val="false"/>
-                <w:sz w:val="18"/>
-                <w:szCs w:val="18"/>
-                <w:color w:val="000000"/>
-              </w:rPr>
-              <w:t xml:space="preserve">Missing</w:t>
-            </w:r>
-          </w:p>
-        </w:tc>
-        <w:tc>
-          <w:tcPr>
-            <w:tcBorders>
-              <w:bottom w:val="none" w:sz="0" w:space="0" w:color="000000"/>
-              <w:top w:val="none" w:sz="0" w:space="0" w:color="000000"/>
-              <w:left w:val="none" w:sz="0" w:space="0" w:color="000000"/>
-              <w:right w:val="none" w:sz="0" w:space="0" w:color="000000"/>
-            </w:tcBorders>
-            <w:shd w:val="clear" w:color="auto" w:fill="FFFFFF"/>
-            <w:tcMar>
-              <w:top w:w="0" w:type="dxa"/>
-              <w:bottom w:w="0" w:type="dxa"/>
-              <w:left w:w="0" w:type="dxa"/>
-              <w:right w:w="0" w:type="dxa"/>
-            </w:tcMar>
-            <w:vAlign w:val="top"/>
-          </w:tcPr>
-          <w:p>
-            <w:pPr>
-              <w:pStyle w:val="Normal"/>
-              <w:jc w:val="center"/>
-              <w:pBdr>
-                <w:bottom w:val="none" w:sz="0" w:space="0" w:color="000000"/>
-                <w:top w:val="none" w:sz="0" w:space="0" w:color="000000"/>
-                <w:left w:val="none" w:sz="0" w:space="0" w:color="000000"/>
-                <w:right w:val="none" w:sz="0" w:space="0" w:color="000000"/>
-              </w:pBdr>
-              <w:spacing w:after="100" w:before="100" w:line="240"/>
-              <w:ind w:left="100" w:right="100" w:firstLine="0" w:firstLineChars="0"/>
-              <w:rPr>
-                <w:rFonts w:ascii="Times New Roman" w:hAnsi="Times New Roman" w:eastAsia="Times New Roman" w:cs="Times New Roman"/>
-                <w:i w:val="false"/>
-                <w:b w:val="false"/>
-                <w:u w:val="none"/>
-                <w:strike w:val="false"/>
-                <w:sz w:val="18"/>
-                <w:szCs w:val="18"/>
-                <w:color w:val="000000"/>
-              </w:rPr>
-            </w:pPr>
-            <w:r>
-              <w:rPr>
-                <w:rFonts w:ascii="Times New Roman" w:hAnsi="Times New Roman" w:eastAsia="Times New Roman" w:cs="Times New Roman"/>
-                <w:i w:val="false"/>
-                <w:b w:val="false"/>
-                <w:u w:val="none"/>
-                <w:strike w:val="false"/>
-                <w:sz w:val="18"/>
-                <w:szCs w:val="18"/>
-                <w:color w:val="000000"/>
-              </w:rPr>
-              <w:t xml:space="preserve">36</w:t>
-            </w:r>
-          </w:p>
-        </w:tc>
-        <w:tc>
-          <w:tcPr>
-            <w:tcBorders>
-              <w:bottom w:val="none" w:sz="0" w:space="0" w:color="000000"/>
-              <w:top w:val="none" w:sz="0" w:space="0" w:color="000000"/>
-              <w:left w:val="none" w:sz="0" w:space="0" w:color="000000"/>
-              <w:right w:val="none" w:sz="0" w:space="0" w:color="000000"/>
-            </w:tcBorders>
-            <w:shd w:val="clear" w:color="auto" w:fill="FFFFFF"/>
-            <w:tcMar>
-              <w:top w:w="0" w:type="dxa"/>
-              <w:bottom w:w="0" w:type="dxa"/>
-              <w:left w:w="0" w:type="dxa"/>
-              <w:right w:w="0" w:type="dxa"/>
-            </w:tcMar>
-            <w:vAlign w:val="top"/>
-          </w:tcPr>
-          <w:p>
-            <w:pPr>
-              <w:pStyle w:val="Normal"/>
-              <w:jc w:val="center"/>
-              <w:pBdr>
-                <w:bottom w:val="none" w:sz="0" w:space="0" w:color="000000"/>
-                <w:top w:val="none" w:sz="0" w:space="0" w:color="000000"/>
-                <w:left w:val="none" w:sz="0" w:space="0" w:color="000000"/>
-                <w:right w:val="none" w:sz="0" w:space="0" w:color="000000"/>
-              </w:pBdr>
-              <w:spacing w:after="100" w:before="100" w:line="240"/>
-              <w:ind w:left="100" w:right="100" w:firstLine="0" w:firstLineChars="0"/>
-              <w:rPr>
-                <w:rFonts w:ascii="Times New Roman" w:hAnsi="Times New Roman" w:eastAsia="Times New Roman" w:cs="Times New Roman"/>
-                <w:i w:val="false"/>
-                <w:b w:val="false"/>
-                <w:u w:val="none"/>
-                <w:strike w:val="false"/>
-                <w:sz w:val="18"/>
-                <w:szCs w:val="18"/>
-                <w:color w:val="000000"/>
-              </w:rPr>
-            </w:pPr>
-            <w:r>
-              <w:rPr>
-                <w:rFonts w:ascii="Times New Roman" w:hAnsi="Times New Roman" w:eastAsia="Times New Roman" w:cs="Times New Roman"/>
-                <w:i w:val="false"/>
-                <w:b w:val="false"/>
-                <w:u w:val="none"/>
-                <w:strike w:val="false"/>
-                <w:sz w:val="18"/>
-                <w:szCs w:val="18"/>
-                <w:color w:val="000000"/>
-              </w:rPr>
-              <w:t xml:space="preserve">17</w:t>
-            </w:r>
-          </w:p>
-        </w:tc>
-        <w:tc>
-          <w:tcPr>
-            <w:tcBorders>
-              <w:bottom w:val="none" w:sz="0" w:space="0" w:color="000000"/>
-              <w:top w:val="none" w:sz="0" w:space="0" w:color="000000"/>
-              <w:left w:val="none" w:sz="0" w:space="0" w:color="000000"/>
-              <w:right w:val="none" w:sz="0" w:space="0" w:color="000000"/>
-            </w:tcBorders>
-            <w:shd w:val="clear" w:color="auto" w:fill="FFFFFF"/>
-            <w:tcMar>
-              <w:top w:w="0" w:type="dxa"/>
-              <w:bottom w:w="0" w:type="dxa"/>
-              <w:left w:w="0" w:type="dxa"/>
-              <w:right w:w="0" w:type="dxa"/>
-            </w:tcMar>
-            <w:vAlign w:val="top"/>
-          </w:tcPr>
-          <w:p>
-            <w:pPr>
-              <w:pStyle w:val="Normal"/>
-              <w:jc w:val="center"/>
-              <w:pBdr>
-                <w:bottom w:val="none" w:sz="0" w:space="0" w:color="000000"/>
-                <w:top w:val="none" w:sz="0" w:space="0" w:color="000000"/>
-                <w:left w:val="none" w:sz="0" w:space="0" w:color="000000"/>
-                <w:right w:val="none" w:sz="0" w:space="0" w:color="000000"/>
-              </w:pBdr>
-              <w:spacing w:after="100" w:before="100" w:line="240"/>
-              <w:ind w:left="100" w:right="100" w:firstLine="0" w:firstLineChars="0"/>
-              <w:rPr>
-                <w:rFonts w:ascii="Times New Roman" w:hAnsi="Times New Roman" w:eastAsia="Times New Roman" w:cs="Times New Roman"/>
-                <w:i w:val="false"/>
-                <w:b w:val="false"/>
-                <w:u w:val="none"/>
-                <w:strike w:val="false"/>
-                <w:sz w:val="18"/>
-                <w:szCs w:val="18"/>
-                <w:color w:val="000000"/>
-              </w:rPr>
-            </w:pPr>
-            <w:r>
-              <w:rPr>
-                <w:rFonts w:ascii="Times New Roman" w:hAnsi="Times New Roman" w:eastAsia="Times New Roman" w:cs="Times New Roman"/>
-                <w:i w:val="false"/>
-                <w:b w:val="false"/>
-                <w:u w:val="none"/>
-                <w:strike w:val="false"/>
-                <w:sz w:val="18"/>
-                <w:szCs w:val="18"/>
-                <w:color w:val="000000"/>
-              </w:rPr>
-              <w:t xml:space="preserve">19</w:t>
-            </w:r>
-          </w:p>
-        </w:tc>
-        <w:tc>
-          <w:tcPr>
-            <w:tcBorders>
-              <w:bottom w:val="none" w:sz="0" w:space="0" w:color="000000"/>
-              <w:top w:val="none" w:sz="0" w:space="0" w:color="000000"/>
-              <w:left w:val="none" w:sz="0" w:space="0" w:color="000000"/>
-              <w:right w:val="none" w:sz="0" w:space="0" w:color="000000"/>
-            </w:tcBorders>
-            <w:shd w:val="clear" w:color="auto" w:fill="FFFFFF"/>
-            <w:tcMar>
-              <w:top w:w="0" w:type="dxa"/>
-              <w:bottom w:w="0" w:type="dxa"/>
-              <w:left w:w="0" w:type="dxa"/>
-              <w:right w:w="0" w:type="dxa"/>
-            </w:tcMar>
-            <w:vAlign w:val="top"/>
-          </w:tcPr>
-          <w:p>
-            <w:pPr>
-              <w:pStyle w:val="Normal"/>
-              <w:jc w:val="center"/>
-              <w:pBdr>
-                <w:bottom w:val="none" w:sz="0" w:space="0" w:color="000000"/>
-                <w:top w:val="none" w:sz="0" w:space="0" w:color="000000"/>
-                <w:left w:val="none" w:sz="0" w:space="0" w:color="000000"/>
-                <w:right w:val="none" w:sz="0" w:space="0" w:color="000000"/>
-              </w:pBdr>
-              <w:spacing w:after="100" w:before="100" w:line="240"/>
-              <w:ind w:left="100" w:right="100" w:firstLine="0" w:firstLineChars="0"/>
-              <w:rPr>
-                <w:rFonts w:ascii="Times New Roman" w:hAnsi="Times New Roman" w:eastAsia="Times New Roman" w:cs="Times New Roman"/>
-                <w:i w:val="false"/>
-                <w:b w:val="false"/>
-                <w:u w:val="none"/>
-                <w:strike w:val="false"/>
-                <w:sz w:val="18"/>
-                <w:szCs w:val="18"/>
-                <w:color w:val="000000"/>
-              </w:rPr>
-            </w:pPr>
-            <w:r>
-              <w:rPr>
-                <w:rFonts w:ascii="Times New Roman" w:hAnsi="Times New Roman" w:eastAsia="Times New Roman" w:cs="Times New Roman"/>
-                <w:i w:val="false"/>
-                <w:b w:val="false"/>
-                <w:u w:val="none"/>
-                <w:strike w:val="false"/>
-                <w:sz w:val="18"/>
-                <w:szCs w:val="18"/>
-                <w:color w:val="000000"/>
-              </w:rPr>
-              <w:t xml:space="preserve"/>
-            </w:r>
-          </w:p>
-        </w:tc>
-      </w:tr>
-      <w:tr>
-        <w:trPr>
-          <w:trHeight w:val="560" w:hRule="auto"/>
-        </w:trPr>
-        <w:tc>
-          <w:tcPr>
-            <w:tcBorders>
-              <w:bottom w:val="none" w:sz="0" w:space="0" w:color="000000"/>
-              <w:top w:val="none" w:sz="0" w:space="0" w:color="000000"/>
-              <w:left w:val="none" w:sz="0" w:space="0" w:color="000000"/>
-              <w:right w:val="none" w:sz="0" w:space="0" w:color="000000"/>
-            </w:tcBorders>
-            <w:shd w:val="clear" w:color="auto" w:fill="FFFFFF"/>
-            <w:tcMar>
-              <w:top w:w="0" w:type="dxa"/>
-              <w:bottom w:w="0" w:type="dxa"/>
-              <w:left w:w="0" w:type="dxa"/>
-              <w:right w:w="0" w:type="dxa"/>
-            </w:tcMar>
-            <w:vAlign w:val="top"/>
-          </w:tcPr>
-          <w:p>
-            <w:pPr>
-              <w:pStyle w:val="Normal"/>
-              <w:jc w:val="left"/>
-              <w:pBdr>
-                <w:bottom w:val="none" w:sz="0" w:space="0" w:color="000000"/>
-                <w:top w:val="none" w:sz="0" w:space="0" w:color="000000"/>
-                <w:left w:val="none" w:sz="0" w:space="0" w:color="000000"/>
-                <w:right w:val="none" w:sz="0" w:space="0" w:color="000000"/>
-              </w:pBdr>
-              <w:spacing w:after="100" w:before="100" w:line="240"/>
-              <w:ind w:left="100" w:right="100" w:firstLine="0" w:firstLineChars="0"/>
-              <w:rPr>
-                <w:rFonts w:ascii="Times New Roman" w:hAnsi="Times New Roman" w:eastAsia="Times New Roman" w:cs="Times New Roman"/>
-                <w:i w:val="false"/>
-                <w:b w:val="true"/>
-                <w:u w:val="none"/>
-                <w:strike w:val="false"/>
-                <w:sz w:val="18"/>
-                <w:szCs w:val="18"/>
-                <w:color w:val="000000"/>
-              </w:rPr>
-            </w:pPr>
-            <w:r>
-              <w:rPr>
-                <w:rFonts w:ascii="Times New Roman" w:hAnsi="Times New Roman" w:eastAsia="Times New Roman" w:cs="Times New Roman"/>
-                <w:i w:val="false"/>
-                <w:b w:val="true"/>
-                <w:u w:val="none"/>
-                <w:strike w:val="false"/>
-                <w:sz w:val="18"/>
-                <w:szCs w:val="18"/>
-                <w:color w:val="000000"/>
-              </w:rPr>
-              <w:t xml:space="preserve">BRAF testing performed</w:t>
-            </w:r>
-          </w:p>
-        </w:tc>
-        <w:tc>
-          <w:tcPr>
-            <w:tcBorders>
-              <w:bottom w:val="none" w:sz="0" w:space="0" w:color="000000"/>
-              <w:top w:val="none" w:sz="0" w:space="0" w:color="000000"/>
-              <w:left w:val="none" w:sz="0" w:space="0" w:color="000000"/>
-              <w:right w:val="none" w:sz="0" w:space="0" w:color="000000"/>
-            </w:tcBorders>
-            <w:shd w:val="clear" w:color="auto" w:fill="FFFFFF"/>
-            <w:tcMar>
-              <w:top w:w="0" w:type="dxa"/>
-              <w:bottom w:w="0" w:type="dxa"/>
-              <w:left w:w="0" w:type="dxa"/>
-              <w:right w:w="0" w:type="dxa"/>
-            </w:tcMar>
-            <w:vAlign w:val="top"/>
-          </w:tcPr>
-          <w:p>
-            <w:pPr>
-              <w:pStyle w:val="Normal"/>
-              <w:jc w:val="center"/>
-              <w:pBdr>
-                <w:bottom w:val="none" w:sz="0" w:space="0" w:color="000000"/>
-                <w:top w:val="none" w:sz="0" w:space="0" w:color="000000"/>
-                <w:left w:val="none" w:sz="0" w:space="0" w:color="000000"/>
-                <w:right w:val="none" w:sz="0" w:space="0" w:color="000000"/>
-              </w:pBdr>
-              <w:spacing w:after="100" w:before="100" w:line="240"/>
-              <w:ind w:left="100" w:right="100" w:firstLine="0" w:firstLineChars="0"/>
-              <w:rPr>
-                <w:rFonts w:ascii="Times New Roman" w:hAnsi="Times New Roman" w:eastAsia="Times New Roman" w:cs="Times New Roman"/>
-                <w:i w:val="false"/>
-                <w:b w:val="false"/>
-                <w:u w:val="none"/>
-                <w:strike w:val="false"/>
-                <w:sz w:val="18"/>
-                <w:szCs w:val="18"/>
-                <w:color w:val="000000"/>
-              </w:rPr>
-            </w:pPr>
-            <w:r>
-              <w:rPr>
-                <w:rFonts w:ascii="Times New Roman" w:hAnsi="Times New Roman" w:eastAsia="Times New Roman" w:cs="Times New Roman"/>
-                <w:i w:val="false"/>
-                <w:b w:val="false"/>
-                <w:u w:val="none"/>
-                <w:strike w:val="false"/>
-                <w:sz w:val="18"/>
-                <w:szCs w:val="18"/>
-                <w:color w:val="000000"/>
-              </w:rPr>
-              <w:t xml:space="preserve"/>
-            </w:r>
-          </w:p>
-        </w:tc>
-        <w:tc>
-          <w:tcPr>
-            <w:tcBorders>
-              <w:bottom w:val="none" w:sz="0" w:space="0" w:color="000000"/>
-              <w:top w:val="none" w:sz="0" w:space="0" w:color="000000"/>
-              <w:left w:val="none" w:sz="0" w:space="0" w:color="000000"/>
-              <w:right w:val="none" w:sz="0" w:space="0" w:color="000000"/>
-            </w:tcBorders>
-            <w:shd w:val="clear" w:color="auto" w:fill="FFFFFF"/>
-            <w:tcMar>
-              <w:top w:w="0" w:type="dxa"/>
-              <w:bottom w:w="0" w:type="dxa"/>
-              <w:left w:w="0" w:type="dxa"/>
-              <w:right w:w="0" w:type="dxa"/>
-            </w:tcMar>
-            <w:vAlign w:val="top"/>
-          </w:tcPr>
-          <w:p>
-            <w:pPr>
-              <w:pStyle w:val="Normal"/>
-              <w:jc w:val="center"/>
-              <w:pBdr>
-                <w:bottom w:val="none" w:sz="0" w:space="0" w:color="000000"/>
-                <w:top w:val="none" w:sz="0" w:space="0" w:color="000000"/>
-                <w:left w:val="none" w:sz="0" w:space="0" w:color="000000"/>
-                <w:right w:val="none" w:sz="0" w:space="0" w:color="000000"/>
-              </w:pBdr>
-              <w:spacing w:after="100" w:before="100" w:line="240"/>
-              <w:ind w:left="100" w:right="100" w:firstLine="0" w:firstLineChars="0"/>
-              <w:rPr>
-                <w:rFonts w:ascii="Times New Roman" w:hAnsi="Times New Roman" w:eastAsia="Times New Roman" w:cs="Times New Roman"/>
-                <w:i w:val="false"/>
-                <w:b w:val="false"/>
-                <w:u w:val="none"/>
-                <w:strike w:val="false"/>
-                <w:sz w:val="18"/>
-                <w:szCs w:val="18"/>
-                <w:color w:val="000000"/>
-              </w:rPr>
-            </w:pPr>
-            <w:r>
-              <w:rPr>
-                <w:rFonts w:ascii="Times New Roman" w:hAnsi="Times New Roman" w:eastAsia="Times New Roman" w:cs="Times New Roman"/>
-                <w:i w:val="false"/>
-                <w:b w:val="false"/>
-                <w:u w:val="none"/>
-                <w:strike w:val="false"/>
-                <w:sz w:val="18"/>
-                <w:szCs w:val="18"/>
-                <w:color w:val="000000"/>
-              </w:rPr>
-              <w:t xml:space="preserve"/>
-            </w:r>
-          </w:p>
-        </w:tc>
-        <w:tc>
-          <w:tcPr>
-            <w:tcBorders>
-              <w:bottom w:val="none" w:sz="0" w:space="0" w:color="000000"/>
-              <w:top w:val="none" w:sz="0" w:space="0" w:color="000000"/>
-              <w:left w:val="none" w:sz="0" w:space="0" w:color="000000"/>
-              <w:right w:val="none" w:sz="0" w:space="0" w:color="000000"/>
-            </w:tcBorders>
-            <w:shd w:val="clear" w:color="auto" w:fill="FFFFFF"/>
-            <w:tcMar>
-              <w:top w:w="0" w:type="dxa"/>
-              <w:bottom w:w="0" w:type="dxa"/>
-              <w:left w:w="0" w:type="dxa"/>
-              <w:right w:w="0" w:type="dxa"/>
-            </w:tcMar>
-            <w:vAlign w:val="top"/>
-          </w:tcPr>
-          <w:p>
-            <w:pPr>
-              <w:pStyle w:val="Normal"/>
-              <w:jc w:val="center"/>
-              <w:pBdr>
-                <w:bottom w:val="none" w:sz="0" w:space="0" w:color="000000"/>
-                <w:top w:val="none" w:sz="0" w:space="0" w:color="000000"/>
-                <w:left w:val="none" w:sz="0" w:space="0" w:color="000000"/>
-                <w:right w:val="none" w:sz="0" w:space="0" w:color="000000"/>
-              </w:pBdr>
-              <w:spacing w:after="100" w:before="100" w:line="240"/>
-              <w:ind w:left="100" w:right="100" w:firstLine="0" w:firstLineChars="0"/>
-              <w:rPr>
-                <w:rFonts w:ascii="Times New Roman" w:hAnsi="Times New Roman" w:eastAsia="Times New Roman" w:cs="Times New Roman"/>
-                <w:i w:val="false"/>
-                <w:b w:val="false"/>
-                <w:u w:val="none"/>
-                <w:strike w:val="false"/>
-                <w:sz w:val="18"/>
-                <w:szCs w:val="18"/>
-                <w:color w:val="000000"/>
-              </w:rPr>
-            </w:pPr>
-            <w:r>
-              <w:rPr>
-                <w:rFonts w:ascii="Times New Roman" w:hAnsi="Times New Roman" w:eastAsia="Times New Roman" w:cs="Times New Roman"/>
-                <w:i w:val="false"/>
-                <w:b w:val="false"/>
-                <w:u w:val="none"/>
-                <w:strike w:val="false"/>
-                <w:sz w:val="18"/>
-                <w:szCs w:val="18"/>
-                <w:color w:val="000000"/>
-              </w:rPr>
-              <w:t xml:space="preserve"/>
-            </w:r>
-          </w:p>
-        </w:tc>
-        <w:tc>
-          <w:tcPr>
-            <w:tcBorders>
-              <w:bottom w:val="none" w:sz="0" w:space="0" w:color="000000"/>
-              <w:top w:val="none" w:sz="0" w:space="0" w:color="000000"/>
-              <w:left w:val="none" w:sz="0" w:space="0" w:color="000000"/>
-              <w:right w:val="none" w:sz="0" w:space="0" w:color="000000"/>
-            </w:tcBorders>
-            <w:shd w:val="clear" w:color="auto" w:fill="FFFFFF"/>
-            <w:tcMar>
-              <w:top w:w="0" w:type="dxa"/>
-              <w:bottom w:w="0" w:type="dxa"/>
-              <w:left w:w="0" w:type="dxa"/>
-              <w:right w:w="0" w:type="dxa"/>
-            </w:tcMar>
-            <w:vAlign w:val="top"/>
-          </w:tcPr>
-          <w:p>
-            <w:pPr>
-              <w:pStyle w:val="Normal"/>
-              <w:jc w:val="center"/>
-              <w:pBdr>
-                <w:bottom w:val="none" w:sz="0" w:space="0" w:color="000000"/>
-                <w:top w:val="none" w:sz="0" w:space="0" w:color="000000"/>
-                <w:left w:val="none" w:sz="0" w:space="0" w:color="000000"/>
-                <w:right w:val="none" w:sz="0" w:space="0" w:color="000000"/>
-              </w:pBdr>
-              <w:spacing w:after="100" w:before="100" w:line="240"/>
-              <w:ind w:left="100" w:right="100" w:firstLine="0" w:firstLineChars="0"/>
-              <w:rPr>
-                <w:rFonts w:ascii="Times New Roman" w:hAnsi="Times New Roman" w:eastAsia="Times New Roman" w:cs="Times New Roman"/>
-                <w:i w:val="false"/>
-                <w:b w:val="false"/>
-                <w:u w:val="none"/>
-                <w:strike w:val="false"/>
-                <w:sz w:val="18"/>
-                <w:szCs w:val="18"/>
-                <w:color w:val="000000"/>
-              </w:rPr>
-            </w:pPr>
-            <w:r>
-              <w:rPr>
-                <w:rFonts w:ascii="Times New Roman" w:hAnsi="Times New Roman" w:eastAsia="Times New Roman" w:cs="Times New Roman"/>
-                <w:i w:val="false"/>
-                <w:b w:val="false"/>
-                <w:u w:val="none"/>
-                <w:strike w:val="false"/>
-                <w:sz w:val="18"/>
-                <w:szCs w:val="18"/>
-                <w:color w:val="000000"/>
-              </w:rPr>
-              <w:t xml:space="preserve">0.095</w:t>
-            </w:r>
-          </w:p>
-        </w:tc>
-      </w:tr>
-      <w:tr>
-        <w:trPr>
-          <w:trHeight w:val="560" w:hRule="auto"/>
-        </w:trPr>
-        <w:tc>
-          <w:tcPr>
-            <w:tcBorders>
-              <w:bottom w:val="none" w:sz="0" w:space="0" w:color="000000"/>
-              <w:top w:val="none" w:sz="0" w:space="0" w:color="000000"/>
-              <w:left w:val="none" w:sz="0" w:space="0" w:color="000000"/>
-              <w:right w:val="none" w:sz="0" w:space="0" w:color="000000"/>
-            </w:tcBorders>
-            <w:shd w:val="clear" w:color="auto" w:fill="FFFFFF"/>
-            <w:tcMar>
-              <w:top w:w="0" w:type="dxa"/>
-              <w:bottom w:w="0" w:type="dxa"/>
-              <w:left w:w="0" w:type="dxa"/>
-              <w:right w:w="0" w:type="dxa"/>
-            </w:tcMar>
-            <w:vAlign w:val="top"/>
-          </w:tcPr>
-          <w:p>
-            <w:pPr>
-              <w:pStyle w:val="Normal"/>
-              <w:jc w:val="left"/>
-              <w:pBdr>
-                <w:bottom w:val="none" w:sz="0" w:space="0" w:color="000000"/>
-                <w:top w:val="none" w:sz="0" w:space="0" w:color="000000"/>
-                <w:left w:val="none" w:sz="0" w:space="0" w:color="000000"/>
-                <w:right w:val="none" w:sz="0" w:space="0" w:color="000000"/>
-              </w:pBdr>
-              <w:spacing w:after="100" w:before="100" w:line="240"/>
-              <w:ind w:left="300" w:right="100" w:firstLine="0" w:firstLineChars="0"/>
-              <w:rPr>
-                <w:rFonts w:ascii="Times New Roman" w:hAnsi="Times New Roman" w:eastAsia="Times New Roman" w:cs="Times New Roman"/>
-                <w:i w:val="false"/>
-                <w:b w:val="false"/>
-                <w:u w:val="none"/>
-                <w:strike w:val="false"/>
-                <w:sz w:val="18"/>
-                <w:szCs w:val="18"/>
-                <w:color w:val="000000"/>
-              </w:rPr>
-            </w:pPr>
-            <w:r>
-              <w:rPr>
-                <w:rFonts w:ascii="Times New Roman" w:hAnsi="Times New Roman" w:eastAsia="Times New Roman" w:cs="Times New Roman"/>
-                <w:i w:val="false"/>
-                <w:b w:val="false"/>
-                <w:u w:val="none"/>
-                <w:strike w:val="false"/>
-                <w:sz w:val="18"/>
-                <w:szCs w:val="18"/>
-                <w:color w:val="000000"/>
-              </w:rPr>
-              <w:t xml:space="preserve">No</w:t>
-            </w:r>
-          </w:p>
-        </w:tc>
-        <w:tc>
-          <w:tcPr>
-            <w:tcBorders>
-              <w:bottom w:val="none" w:sz="0" w:space="0" w:color="000000"/>
-              <w:top w:val="none" w:sz="0" w:space="0" w:color="000000"/>
-              <w:left w:val="none" w:sz="0" w:space="0" w:color="000000"/>
-              <w:right w:val="none" w:sz="0" w:space="0" w:color="000000"/>
-            </w:tcBorders>
-            <w:shd w:val="clear" w:color="auto" w:fill="FFFFFF"/>
-            <w:tcMar>
-              <w:top w:w="0" w:type="dxa"/>
-              <w:bottom w:w="0" w:type="dxa"/>
-              <w:left w:w="0" w:type="dxa"/>
-              <w:right w:w="0" w:type="dxa"/>
-            </w:tcMar>
-            <w:vAlign w:val="top"/>
-          </w:tcPr>
-          <w:p>
-            <w:pPr>
-              <w:pStyle w:val="Normal"/>
-              <w:jc w:val="center"/>
-              <w:pBdr>
-                <w:bottom w:val="none" w:sz="0" w:space="0" w:color="000000"/>
-                <w:top w:val="none" w:sz="0" w:space="0" w:color="000000"/>
-                <w:left w:val="none" w:sz="0" w:space="0" w:color="000000"/>
-                <w:right w:val="none" w:sz="0" w:space="0" w:color="000000"/>
-              </w:pBdr>
-              <w:spacing w:after="100" w:before="100" w:line="240"/>
-              <w:ind w:left="100" w:right="100" w:firstLine="0" w:firstLineChars="0"/>
-              <w:rPr>
-                <w:rFonts w:ascii="Times New Roman" w:hAnsi="Times New Roman" w:eastAsia="Times New Roman" w:cs="Times New Roman"/>
-                <w:i w:val="false"/>
-                <w:b w:val="false"/>
-                <w:u w:val="none"/>
-                <w:strike w:val="false"/>
-                <w:sz w:val="18"/>
-                <w:szCs w:val="18"/>
-                <w:color w:val="000000"/>
-              </w:rPr>
-            </w:pPr>
-            <w:r>
-              <w:rPr>
-                <w:rFonts w:ascii="Times New Roman" w:hAnsi="Times New Roman" w:eastAsia="Times New Roman" w:cs="Times New Roman"/>
-                <w:i w:val="false"/>
-                <w:b w:val="false"/>
-                <w:u w:val="none"/>
-                <w:strike w:val="false"/>
-                <w:sz w:val="18"/>
-                <w:szCs w:val="18"/>
-                <w:color w:val="000000"/>
-              </w:rPr>
-              <w:t xml:space="preserve">359 (92.8%)</w:t>
-            </w:r>
-          </w:p>
-        </w:tc>
-        <w:tc>
-          <w:tcPr>
-            <w:tcBorders>
-              <w:bottom w:val="none" w:sz="0" w:space="0" w:color="000000"/>
-              <w:top w:val="none" w:sz="0" w:space="0" w:color="000000"/>
-              <w:left w:val="none" w:sz="0" w:space="0" w:color="000000"/>
-              <w:right w:val="none" w:sz="0" w:space="0" w:color="000000"/>
-            </w:tcBorders>
-            <w:shd w:val="clear" w:color="auto" w:fill="FFFFFF"/>
-            <w:tcMar>
-              <w:top w:w="0" w:type="dxa"/>
-              <w:bottom w:w="0" w:type="dxa"/>
-              <w:left w:w="0" w:type="dxa"/>
-              <w:right w:w="0" w:type="dxa"/>
-            </w:tcMar>
-            <w:vAlign w:val="top"/>
-          </w:tcPr>
-          <w:p>
-            <w:pPr>
-              <w:pStyle w:val="Normal"/>
-              <w:jc w:val="center"/>
-              <w:pBdr>
-                <w:bottom w:val="none" w:sz="0" w:space="0" w:color="000000"/>
-                <w:top w:val="none" w:sz="0" w:space="0" w:color="000000"/>
-                <w:left w:val="none" w:sz="0" w:space="0" w:color="000000"/>
-                <w:right w:val="none" w:sz="0" w:space="0" w:color="000000"/>
-              </w:pBdr>
-              <w:spacing w:after="100" w:before="100" w:line="240"/>
-              <w:ind w:left="100" w:right="100" w:firstLine="0" w:firstLineChars="0"/>
-              <w:rPr>
-                <w:rFonts w:ascii="Times New Roman" w:hAnsi="Times New Roman" w:eastAsia="Times New Roman" w:cs="Times New Roman"/>
-                <w:i w:val="false"/>
-                <w:b w:val="false"/>
-                <w:u w:val="none"/>
-                <w:strike w:val="false"/>
-                <w:sz w:val="18"/>
-                <w:szCs w:val="18"/>
-                <w:color w:val="000000"/>
-              </w:rPr>
-            </w:pPr>
-            <w:r>
-              <w:rPr>
-                <w:rFonts w:ascii="Times New Roman" w:hAnsi="Times New Roman" w:eastAsia="Times New Roman" w:cs="Times New Roman"/>
-                <w:i w:val="false"/>
-                <w:b w:val="false"/>
-                <w:u w:val="none"/>
-                <w:strike w:val="false"/>
-                <w:sz w:val="18"/>
-                <w:szCs w:val="18"/>
-                <w:color w:val="000000"/>
-              </w:rPr>
-              <w:t xml:space="preserve">187 (94.9%)</w:t>
-            </w:r>
-          </w:p>
-        </w:tc>
-        <w:tc>
-          <w:tcPr>
-            <w:tcBorders>
-              <w:bottom w:val="none" w:sz="0" w:space="0" w:color="000000"/>
-              <w:top w:val="none" w:sz="0" w:space="0" w:color="000000"/>
-              <w:left w:val="none" w:sz="0" w:space="0" w:color="000000"/>
-              <w:right w:val="none" w:sz="0" w:space="0" w:color="000000"/>
-            </w:tcBorders>
-            <w:shd w:val="clear" w:color="auto" w:fill="FFFFFF"/>
-            <w:tcMar>
-              <w:top w:w="0" w:type="dxa"/>
-              <w:bottom w:w="0" w:type="dxa"/>
-              <w:left w:w="0" w:type="dxa"/>
-              <w:right w:w="0" w:type="dxa"/>
-            </w:tcMar>
-            <w:vAlign w:val="top"/>
-          </w:tcPr>
-          <w:p>
-            <w:pPr>
-              <w:pStyle w:val="Normal"/>
-              <w:jc w:val="center"/>
-              <w:pBdr>
-                <w:bottom w:val="none" w:sz="0" w:space="0" w:color="000000"/>
-                <w:top w:val="none" w:sz="0" w:space="0" w:color="000000"/>
-                <w:left w:val="none" w:sz="0" w:space="0" w:color="000000"/>
-                <w:right w:val="none" w:sz="0" w:space="0" w:color="000000"/>
-              </w:pBdr>
-              <w:spacing w:after="100" w:before="100" w:line="240"/>
-              <w:ind w:left="100" w:right="100" w:firstLine="0" w:firstLineChars="0"/>
-              <w:rPr>
-                <w:rFonts w:ascii="Times New Roman" w:hAnsi="Times New Roman" w:eastAsia="Times New Roman" w:cs="Times New Roman"/>
-                <w:i w:val="false"/>
-                <w:b w:val="false"/>
-                <w:u w:val="none"/>
-                <w:strike w:val="false"/>
-                <w:sz w:val="18"/>
-                <w:szCs w:val="18"/>
-                <w:color w:val="000000"/>
-              </w:rPr>
-            </w:pPr>
-            <w:r>
-              <w:rPr>
-                <w:rFonts w:ascii="Times New Roman" w:hAnsi="Times New Roman" w:eastAsia="Times New Roman" w:cs="Times New Roman"/>
-                <w:i w:val="false"/>
-                <w:b w:val="false"/>
-                <w:u w:val="none"/>
-                <w:strike w:val="false"/>
-                <w:sz w:val="18"/>
-                <w:szCs w:val="18"/>
-                <w:color w:val="000000"/>
-              </w:rPr>
-              <w:t xml:space="preserve">172 (90.5%)</w:t>
-            </w:r>
-          </w:p>
-        </w:tc>
-        <w:tc>
-          <w:tcPr>
-            <w:tcBorders>
-              <w:bottom w:val="none" w:sz="0" w:space="0" w:color="000000"/>
-              <w:top w:val="none" w:sz="0" w:space="0" w:color="000000"/>
-              <w:left w:val="none" w:sz="0" w:space="0" w:color="000000"/>
-              <w:right w:val="none" w:sz="0" w:space="0" w:color="000000"/>
-            </w:tcBorders>
-            <w:shd w:val="clear" w:color="auto" w:fill="FFFFFF"/>
-            <w:tcMar>
-              <w:top w:w="0" w:type="dxa"/>
-              <w:bottom w:w="0" w:type="dxa"/>
-              <w:left w:w="0" w:type="dxa"/>
-              <w:right w:w="0" w:type="dxa"/>
-            </w:tcMar>
-            <w:vAlign w:val="top"/>
-          </w:tcPr>
-          <w:p>
-            <w:pPr>
-              <w:pStyle w:val="Normal"/>
-              <w:jc w:val="center"/>
-              <w:pBdr>
-                <w:bottom w:val="none" w:sz="0" w:space="0" w:color="000000"/>
-                <w:top w:val="none" w:sz="0" w:space="0" w:color="000000"/>
-                <w:left w:val="none" w:sz="0" w:space="0" w:color="000000"/>
-                <w:right w:val="none" w:sz="0" w:space="0" w:color="000000"/>
-              </w:pBdr>
-              <w:spacing w:after="100" w:before="100" w:line="240"/>
-              <w:ind w:left="100" w:right="100" w:firstLine="0" w:firstLineChars="0"/>
-              <w:rPr>
-                <w:rFonts w:ascii="Times New Roman" w:hAnsi="Times New Roman" w:eastAsia="Times New Roman" w:cs="Times New Roman"/>
-                <w:i w:val="false"/>
-                <w:b w:val="false"/>
-                <w:u w:val="none"/>
-                <w:strike w:val="false"/>
-                <w:sz w:val="18"/>
-                <w:szCs w:val="18"/>
-                <w:color w:val="000000"/>
-              </w:rPr>
-            </w:pPr>
-            <w:r>
-              <w:rPr>
-                <w:rFonts w:ascii="Times New Roman" w:hAnsi="Times New Roman" w:eastAsia="Times New Roman" w:cs="Times New Roman"/>
-                <w:i w:val="false"/>
-                <w:b w:val="false"/>
-                <w:u w:val="none"/>
-                <w:strike w:val="false"/>
-                <w:sz w:val="18"/>
-                <w:szCs w:val="18"/>
-                <w:color w:val="000000"/>
-              </w:rPr>
-              <w:t xml:space="preserve"/>
-            </w:r>
-          </w:p>
-        </w:tc>
-      </w:tr>
-      <w:tr>
-        <w:trPr>
-          <w:trHeight w:val="560" w:hRule="auto"/>
-        </w:trPr>
-        <w:tc>
-          <w:tcPr>
-            <w:tcBorders>
-              <w:bottom w:val="none" w:sz="0" w:space="0" w:color="000000"/>
-              <w:top w:val="none" w:sz="0" w:space="0" w:color="000000"/>
-              <w:left w:val="none" w:sz="0" w:space="0" w:color="000000"/>
-              <w:right w:val="none" w:sz="0" w:space="0" w:color="000000"/>
-            </w:tcBorders>
-            <w:shd w:val="clear" w:color="auto" w:fill="FFFFFF"/>
-            <w:tcMar>
-              <w:top w:w="0" w:type="dxa"/>
-              <w:bottom w:w="0" w:type="dxa"/>
-              <w:left w:w="0" w:type="dxa"/>
-              <w:right w:w="0" w:type="dxa"/>
-            </w:tcMar>
-            <w:vAlign w:val="top"/>
-          </w:tcPr>
-          <w:p>
-            <w:pPr>
-              <w:pStyle w:val="Normal"/>
-              <w:jc w:val="left"/>
-              <w:pBdr>
-                <w:bottom w:val="none" w:sz="0" w:space="0" w:color="000000"/>
-                <w:top w:val="none" w:sz="0" w:space="0" w:color="000000"/>
-                <w:left w:val="none" w:sz="0" w:space="0" w:color="000000"/>
-                <w:right w:val="none" w:sz="0" w:space="0" w:color="000000"/>
-              </w:pBdr>
-              <w:spacing w:after="100" w:before="100" w:line="240"/>
-              <w:ind w:left="300" w:right="100" w:firstLine="0" w:firstLineChars="0"/>
-              <w:rPr>
-                <w:rFonts w:ascii="Times New Roman" w:hAnsi="Times New Roman" w:eastAsia="Times New Roman" w:cs="Times New Roman"/>
-                <w:i w:val="false"/>
-                <w:b w:val="false"/>
-                <w:u w:val="none"/>
-                <w:strike w:val="false"/>
-                <w:sz w:val="18"/>
-                <w:szCs w:val="18"/>
-                <w:color w:val="000000"/>
-              </w:rPr>
-            </w:pPr>
-            <w:r>
-              <w:rPr>
-                <w:rFonts w:ascii="Times New Roman" w:hAnsi="Times New Roman" w:eastAsia="Times New Roman" w:cs="Times New Roman"/>
-                <w:i w:val="false"/>
-                <w:b w:val="false"/>
-                <w:u w:val="none"/>
-                <w:strike w:val="false"/>
-                <w:sz w:val="18"/>
-                <w:szCs w:val="18"/>
-                <w:color w:val="000000"/>
-              </w:rPr>
-              <w:t xml:space="preserve">Yes</w:t>
-            </w:r>
-          </w:p>
-        </w:tc>
-        <w:tc>
-          <w:tcPr>
-            <w:tcBorders>
-              <w:bottom w:val="none" w:sz="0" w:space="0" w:color="000000"/>
-              <w:top w:val="none" w:sz="0" w:space="0" w:color="000000"/>
-              <w:left w:val="none" w:sz="0" w:space="0" w:color="000000"/>
-              <w:right w:val="none" w:sz="0" w:space="0" w:color="000000"/>
-            </w:tcBorders>
-            <w:shd w:val="clear" w:color="auto" w:fill="FFFFFF"/>
-            <w:tcMar>
-              <w:top w:w="0" w:type="dxa"/>
-              <w:bottom w:w="0" w:type="dxa"/>
-              <w:left w:w="0" w:type="dxa"/>
-              <w:right w:w="0" w:type="dxa"/>
-            </w:tcMar>
-            <w:vAlign w:val="top"/>
-          </w:tcPr>
-          <w:p>
-            <w:pPr>
-              <w:pStyle w:val="Normal"/>
-              <w:jc w:val="center"/>
-              <w:pBdr>
-                <w:bottom w:val="none" w:sz="0" w:space="0" w:color="000000"/>
-                <w:top w:val="none" w:sz="0" w:space="0" w:color="000000"/>
-                <w:left w:val="none" w:sz="0" w:space="0" w:color="000000"/>
-                <w:right w:val="none" w:sz="0" w:space="0" w:color="000000"/>
-              </w:pBdr>
-              <w:spacing w:after="100" w:before="100" w:line="240"/>
-              <w:ind w:left="100" w:right="100" w:firstLine="0" w:firstLineChars="0"/>
-              <w:rPr>
-                <w:rFonts w:ascii="Times New Roman" w:hAnsi="Times New Roman" w:eastAsia="Times New Roman" w:cs="Times New Roman"/>
-                <w:i w:val="false"/>
-                <w:b w:val="false"/>
-                <w:u w:val="none"/>
-                <w:strike w:val="false"/>
-                <w:sz w:val="18"/>
-                <w:szCs w:val="18"/>
-                <w:color w:val="000000"/>
-              </w:rPr>
-            </w:pPr>
-            <w:r>
-              <w:rPr>
-                <w:rFonts w:ascii="Times New Roman" w:hAnsi="Times New Roman" w:eastAsia="Times New Roman" w:cs="Times New Roman"/>
-                <w:i w:val="false"/>
-                <w:b w:val="false"/>
-                <w:u w:val="none"/>
-                <w:strike w:val="false"/>
-                <w:sz w:val="18"/>
-                <w:szCs w:val="18"/>
-                <w:color w:val="000000"/>
-              </w:rPr>
-              <w:t xml:space="preserve">28 (7.2%)</w:t>
-            </w:r>
-          </w:p>
-        </w:tc>
-        <w:tc>
-          <w:tcPr>
-            <w:tcBorders>
-              <w:bottom w:val="none" w:sz="0" w:space="0" w:color="000000"/>
-              <w:top w:val="none" w:sz="0" w:space="0" w:color="000000"/>
-              <w:left w:val="none" w:sz="0" w:space="0" w:color="000000"/>
-              <w:right w:val="none" w:sz="0" w:space="0" w:color="000000"/>
-            </w:tcBorders>
-            <w:shd w:val="clear" w:color="auto" w:fill="FFFFFF"/>
-            <w:tcMar>
-              <w:top w:w="0" w:type="dxa"/>
-              <w:bottom w:w="0" w:type="dxa"/>
-              <w:left w:w="0" w:type="dxa"/>
-              <w:right w:w="0" w:type="dxa"/>
-            </w:tcMar>
-            <w:vAlign w:val="top"/>
-          </w:tcPr>
-          <w:p>
-            <w:pPr>
-              <w:pStyle w:val="Normal"/>
-              <w:jc w:val="center"/>
-              <w:pBdr>
-                <w:bottom w:val="none" w:sz="0" w:space="0" w:color="000000"/>
-                <w:top w:val="none" w:sz="0" w:space="0" w:color="000000"/>
-                <w:left w:val="none" w:sz="0" w:space="0" w:color="000000"/>
-                <w:right w:val="none" w:sz="0" w:space="0" w:color="000000"/>
-              </w:pBdr>
-              <w:spacing w:after="100" w:before="100" w:line="240"/>
-              <w:ind w:left="100" w:right="100" w:firstLine="0" w:firstLineChars="0"/>
-              <w:rPr>
-                <w:rFonts w:ascii="Times New Roman" w:hAnsi="Times New Roman" w:eastAsia="Times New Roman" w:cs="Times New Roman"/>
-                <w:i w:val="false"/>
-                <w:b w:val="false"/>
-                <w:u w:val="none"/>
-                <w:strike w:val="false"/>
-                <w:sz w:val="18"/>
-                <w:szCs w:val="18"/>
-                <w:color w:val="000000"/>
-              </w:rPr>
-            </w:pPr>
-            <w:r>
-              <w:rPr>
-                <w:rFonts w:ascii="Times New Roman" w:hAnsi="Times New Roman" w:eastAsia="Times New Roman" w:cs="Times New Roman"/>
-                <w:i w:val="false"/>
-                <w:b w:val="false"/>
-                <w:u w:val="none"/>
-                <w:strike w:val="false"/>
-                <w:sz w:val="18"/>
-                <w:szCs w:val="18"/>
-                <w:color w:val="000000"/>
-              </w:rPr>
-              <w:t xml:space="preserve">10 (5.1%)</w:t>
-            </w:r>
-          </w:p>
-        </w:tc>
-        <w:tc>
-          <w:tcPr>
-            <w:tcBorders>
-              <w:bottom w:val="none" w:sz="0" w:space="0" w:color="000000"/>
-              <w:top w:val="none" w:sz="0" w:space="0" w:color="000000"/>
-              <w:left w:val="none" w:sz="0" w:space="0" w:color="000000"/>
-              <w:right w:val="none" w:sz="0" w:space="0" w:color="000000"/>
-            </w:tcBorders>
-            <w:shd w:val="clear" w:color="auto" w:fill="FFFFFF"/>
-            <w:tcMar>
-              <w:top w:w="0" w:type="dxa"/>
-              <w:bottom w:w="0" w:type="dxa"/>
-              <w:left w:w="0" w:type="dxa"/>
-              <w:right w:w="0" w:type="dxa"/>
-            </w:tcMar>
-            <w:vAlign w:val="top"/>
-          </w:tcPr>
-          <w:p>
-            <w:pPr>
-              <w:pStyle w:val="Normal"/>
-              <w:jc w:val="center"/>
-              <w:pBdr>
-                <w:bottom w:val="none" w:sz="0" w:space="0" w:color="000000"/>
-                <w:top w:val="none" w:sz="0" w:space="0" w:color="000000"/>
-                <w:left w:val="none" w:sz="0" w:space="0" w:color="000000"/>
-                <w:right w:val="none" w:sz="0" w:space="0" w:color="000000"/>
-              </w:pBdr>
-              <w:spacing w:after="100" w:before="100" w:line="240"/>
-              <w:ind w:left="100" w:right="100" w:firstLine="0" w:firstLineChars="0"/>
-              <w:rPr>
-                <w:rFonts w:ascii="Times New Roman" w:hAnsi="Times New Roman" w:eastAsia="Times New Roman" w:cs="Times New Roman"/>
-                <w:i w:val="false"/>
-                <w:b w:val="false"/>
-                <w:u w:val="none"/>
-                <w:strike w:val="false"/>
-                <w:sz w:val="18"/>
-                <w:szCs w:val="18"/>
-                <w:color w:val="000000"/>
-              </w:rPr>
-            </w:pPr>
-            <w:r>
-              <w:rPr>
-                <w:rFonts w:ascii="Times New Roman" w:hAnsi="Times New Roman" w:eastAsia="Times New Roman" w:cs="Times New Roman"/>
-                <w:i w:val="false"/>
-                <w:b w:val="false"/>
-                <w:u w:val="none"/>
-                <w:strike w:val="false"/>
-                <w:sz w:val="18"/>
-                <w:szCs w:val="18"/>
-                <w:color w:val="000000"/>
-              </w:rPr>
-              <w:t xml:space="preserve">18 (9.5%)</w:t>
-            </w:r>
-          </w:p>
-        </w:tc>
-        <w:tc>
-          <w:tcPr>
-            <w:tcBorders>
-              <w:bottom w:val="none" w:sz="0" w:space="0" w:color="000000"/>
-              <w:top w:val="none" w:sz="0" w:space="0" w:color="000000"/>
-              <w:left w:val="none" w:sz="0" w:space="0" w:color="000000"/>
-              <w:right w:val="none" w:sz="0" w:space="0" w:color="000000"/>
-            </w:tcBorders>
-            <w:shd w:val="clear" w:color="auto" w:fill="FFFFFF"/>
-            <w:tcMar>
-              <w:top w:w="0" w:type="dxa"/>
-              <w:bottom w:w="0" w:type="dxa"/>
-              <w:left w:w="0" w:type="dxa"/>
-              <w:right w:w="0" w:type="dxa"/>
-            </w:tcMar>
-            <w:vAlign w:val="top"/>
-          </w:tcPr>
-          <w:p>
-            <w:pPr>
-              <w:pStyle w:val="Normal"/>
-              <w:jc w:val="center"/>
-              <w:pBdr>
-                <w:bottom w:val="none" w:sz="0" w:space="0" w:color="000000"/>
-                <w:top w:val="none" w:sz="0" w:space="0" w:color="000000"/>
-                <w:left w:val="none" w:sz="0" w:space="0" w:color="000000"/>
-                <w:right w:val="none" w:sz="0" w:space="0" w:color="000000"/>
-              </w:pBdr>
-              <w:spacing w:after="100" w:before="100" w:line="240"/>
-              <w:ind w:left="100" w:right="100" w:firstLine="0" w:firstLineChars="0"/>
-              <w:rPr>
-                <w:rFonts w:ascii="Times New Roman" w:hAnsi="Times New Roman" w:eastAsia="Times New Roman" w:cs="Times New Roman"/>
-                <w:i w:val="false"/>
-                <w:b w:val="false"/>
-                <w:u w:val="none"/>
-                <w:strike w:val="false"/>
-                <w:sz w:val="18"/>
-                <w:szCs w:val="18"/>
-                <w:color w:val="000000"/>
-              </w:rPr>
-            </w:pPr>
-            <w:r>
-              <w:rPr>
-                <w:rFonts w:ascii="Times New Roman" w:hAnsi="Times New Roman" w:eastAsia="Times New Roman" w:cs="Times New Roman"/>
-                <w:i w:val="false"/>
-                <w:b w:val="false"/>
-                <w:u w:val="none"/>
-                <w:strike w:val="false"/>
-                <w:sz w:val="18"/>
-                <w:szCs w:val="18"/>
-                <w:color w:val="000000"/>
-              </w:rPr>
-              <w:t xml:space="preserve"/>
-            </w:r>
-          </w:p>
-        </w:tc>
-      </w:tr>
-      <w:tr>
-        <w:trPr>
           <w:trHeight w:val="570" w:hRule="auto"/>
         </w:trPr>
         <w:tc>
@@ -21218,7 +18978,7 @@
                 <w:szCs w:val="18"/>
                 <w:color w:val="000000"/>
               </w:rPr>
-              <w:t xml:space="preserve">49</w:t>
+              <w:t xml:space="preserve">45</w:t>
             </w:r>
           </w:p>
         </w:tc>
@@ -21328,7 +19088,7 @@
                 <w:szCs w:val="18"/>
                 <w:color w:val="000000"/>
               </w:rPr>
-              <w:t xml:space="preserve">29</w:t>
+              <w:t xml:space="preserve">25</w:t>
             </w:r>
           </w:p>
         </w:tc>

</xml_diff>